<commit_message>
Expand Medicare manuscript to seven publication figures
</commit_message>
<xml_diff>
--- a/outputs/01a0ab2c-c289-74e3-8442-d7966be4cbe8/Medicare_equity_research_and_health_IT_manuscript_2026-09-21.docx
+++ b/outputs/01a0ab2c-c289-74e3-8442-d7966be4cbe8/Medicare_equity_research_and_health_IT_manuscript_2026-09-21.docx
@@ -175,7 +175,7 @@
     </w:p>
     <w:p>
       <w:r>
-        <w:t>Three questions organize the empirical review. First, among patients with comparable clinical need, how do coverage, costs and receipt of appropriate care differ by recorded sex or gender? Second, how are sex-associated services, including shared-system and reproductive care, valued relative to defensible clinical and resource comparators? Third, what evidence links a financing or administrative mechanism to a care gap? A fourth, explicitly separate question asks which interventions might address an established gap and what validation would be required. Physician-gender payment studies provide context and are not pooled with patient comparisons.</w:t>
+        <w:t>Three questions organize the empirical review. First, among patients with comparable clinical need, how do coverage, costs and receipt of appropriate care differ by recorded sex or gender? Second, how are sex-associated services, including shared-system and reproductive care, valued relative to defensible clinical and resource comparators? Third, what evidence links a financing or administrative mechanism to a care gap? A fourth, explicitly separate question asks which interventions might address an established gap and what validation would be required. Physician-gender payment studies provide context and are not pooled with patient comparisons. Figure 1 separates the analytical subjects and their inference boundaries.</w:t>
       </w:r>
     </w:p>
     <w:p>
@@ -188,12 +188,12 @@
     </w:p>
     <w:p>
       <w:r>
-        <w:t>The investigator's existing scope concerns cisgender women and men and excludes transgender-focused patient studies and gender-affirming-care indications. Administrative male/female coding does not establish gender identity. Under the current rule, studies with unreported identity remain provisional candidates, outside confirmed-cisgender primary estimates. No individual is classified through anatomy, diagnosis or medicine use. Mixed-payer or mixed-population studies require separately extractable eligible results; their presence alone does not establish Medicare-specific effectiveness.</w:t>
-      </w:r>
-    </w:p>
-    <w:p>
-      <w:r>
-        <w:t>Care is classified as shared systems or functions, female reproductive anatomy, male reproductive anatomy, female reproductive physiology, male reproductive physiology, or mixed/site-dependent services. Bone, breast, lymphatic and renal care can concern shared systems even when disease burden or eligibility differs by sex. Menopause is a physiological context; a hormone name alone does not establish the anatomical category. Sex-defined policy eligibility is recorded separately from anatomy and clinical need. Bundled or site-dependent procedures require component-level review.</w:t>
+        <w:t>The investigator's existing scope concerns cisgender women and men and excludes transgender-focused patient studies and gender-affirming-care indications. Administrative male/female coding does not establish gender identity. Under the current rule, studies with unreported identity remain provisional candidates, outside confirmed-cisgender primary estimates. No individual is classified through anatomy, diagnosis or medicine use. Mixed-payer or mixed-population studies require separately extractable eligible results; their presence alone does not establish Medicare-specific effectiveness. Figure 2 distinguishes adopted population scope, proposed screening rules and unresolved eligibility.</w:t>
+      </w:r>
+    </w:p>
+    <w:p>
+      <w:r>
+        <w:t>Care is classified as shared systems or functions, female reproductive anatomy, male reproductive anatomy, female reproductive physiology, male reproductive physiology, or mixed/site-dependent services. Bone, breast, lymphatic and renal care can concern shared systems even when disease burden or eligibility differs by sex. Menopause is a physiological context; a hormone name alone does not establish the anatomical category. Sex-defined policy eligibility is recorded separately from anatomy and clinical need. Bundled or site-dependent procedures require component-level review. Figure 3 maps these clinical categories and the separate policy and measurement axes.</w:t>
       </w:r>
     </w:p>
     <w:p>
@@ -226,7 +226,7 @@
     </w:p>
     <w:p>
       <w:r>
-        <w:t>A transparent keyword queue orders records for review and retains every record. It is not a validated classifier or an exclusion rule. The prior 50-record calibration set remains available with blank human decision fields. The 38-record working register was assembled through earlier selected retrieval and cannot be treated as the output of screening the 59,147-record corpus. Targeted intervention retrieval and policy searches are separate source routes requiring reconciliation. Searches of the other planned databases and independent PRESS review remain pending.</w:t>
+        <w:t>A transparent keyword queue orders records for review and retains every record. It is not a validated classifier or an exclusion rule. The prior 50-record calibration set remains available with blank human decision fields. The 38-record working register was assembled through earlier selected retrieval and cannot be treated as the output of screening the 59,147-record corpus. Targeted intervention retrieval and policy searches are separate source routes requiring reconciliation. Searches of the other planned databases and independent PRESS review remain pending. Figure 4 shows the executed retrieval state without implying completed selection.</w:t>
       </w:r>
     </w:p>
     <w:p>
@@ -262,7 +262,7 @@
     </w:p>
     <w:p>
       <w:r>
-        <w:t>Coverage, allowed payments, work RVUs, total RVUs, physician receipts, patient spending and realized access are synthesized separately. Historical observations are aligned to their policy period. Within-condition patient contrasts are separated from cross-procedure comparisons and assessments within a sex-linked indication. Null, contradictory and imprecise findings receive the same interpretive attention as favorable results. No meta-analysis is performed because compatible, independently adjudicated outcome groups have not been established. SWiM will inform suitable non-meta-analytic intervention syntheses; GRADE or CERQual will be applied only to appropriate outcome-specific bodies of evidence, not to individual papers as a score. [M-002; M-007; M-008]</w:t>
+        <w:t>Coverage, allowed payments, work RVUs, total RVUs, physician receipts, patient spending and realized access are synthesized separately. Historical observations are aligned to their policy period. Figure 5 distinguishes financing measures, care access and health outcomes; connections are hypotheses requiring evidence. Within-condition patient contrasts are separated from cross-procedure comparisons and assessments within a sex-linked indication. Null, contradictory and imprecise findings receive the same interpretive attention as favorable results. No meta-analysis is performed because compatible, independently adjudicated outcome groups have not been established. SWiM will inform suitable non-meta-analytic intervention syntheses; GRADE or CERQual will be applied only to appropriate outcome-specific bodies of evidence, not to individual papers as a score. [M-002; M-007; M-008]</w:t>
       </w:r>
     </w:p>
     <w:p>
@@ -288,7 +288,7 @@
     </w:p>
     <w:p>
       <w:r>
-        <w:t>The active register comprises 38 candidate or contextual records spanning patient care, service valuation, physician gender and broad clinical frameworks. Clinical efficacy or other-payer studies within that register support background reasoning; they do not become eligible Medicare-equity studies through inclusion in the register. Eight earlier scope-excluded records and the Lancet correction remain in the audit trail. No final included-study count or completed PRISMA selection flow is available. Table 1 summarizes selected examples and their inference limits. Figure 1 presents the actual retrieval state and keeps selected evidence separate from the unscreened corpus.</w:t>
+        <w:t>The active register comprises 38 candidate or contextual records spanning patient care, service valuation, physician gender and broad clinical frameworks. Clinical efficacy or other-payer studies within that register support background reasoning; they do not become eligible Medicare-equity studies through inclusion in the register. Eight earlier scope-excluded records and the Lancet correction remain in the audit trail. No final included-study count or completed PRISMA selection flow is available. Table 1 summarizes selected examples and their inference limits. Figure 4 presents the actual retrieval state and keeps selected evidence separate from the unscreened corpus.</w:t>
       </w:r>
     </w:p>
     <w:p>
@@ -401,7 +401,7 @@
     </w:p>
     <w:p>
       <w:r>
-        <w:t>The intervention evidence and current policy assessment are reported in the accompanying opportunity records and Table 2. Medication-affordability and post-fracture coordination have concrete intervention precedents within the selected literature. They warrant prospective testing of specified workflows, rather than claims that a new digital product has already been validated. Authorization, equipment fulfillment, kidney-care coordination and valuation research have different evidence gaps and should not inherit the effectiveness of an intervention in another domain.</w:t>
+        <w:t>The intervention evidence and current policy assessment are reported in the accompanying opportunity records and Table 2. Figure 6 maps the six unranked domains to proposed workflows and evaluation targets. Medication-affordability and post-fracture coordination have concrete intervention precedents within the selected literature. They warrant prospective testing of specified workflows, rather than claims that a new digital product has already been validated. Authorization, equipment fulfillment, kidney-care coordination and valuation research have different evidence gaps and should not inherit the effectiveness of an intervention in another domain.</w:t>
       </w:r>
     </w:p>
     <w:p>
@@ -442,7 +442,7 @@
     </w:p>
     <w:p>
       <w:r>
-        <w:t>The opportunity framework in Figure 2 requires evidence about need, mechanism, intervention, benefit and equity, and implementation. A project should define a patient-relevant primary outcome, a clinically appropriate denominator and potential harms before selecting a technology. Developers should test against usual care and credible existing services. Equity analysis should estimate differences in absolute benefit and reach across relevant populations, with interaction estimates where justified. Separate within-group significance tests do not establish a between-group difference. Digital access, language, disability and caregiver involvement may affect reach and should be measured rather than assumed.</w:t>
+        <w:t>The opportunity framework in Figure 7 requires evidence about need, mechanism, intervention, benefit and equity, and implementation. A project should define a patient-relevant primary outcome, a clinically appropriate denominator and potential harms before selecting a technology. Developers should test against usual care and credible existing services. Equity analysis should estimate differences in absolute benefit and reach across relevant populations, with interaction estimates where justified. Separate within-group significance tests do not establish a between-group difference. Digital access, language, disability and caregiver involvement may affect reach and should be measured rather than assumed.</w:t>
       </w:r>
     </w:p>
     <w:p>
@@ -494,7 +494,7 @@
         <w:drawing>
           <wp:inline xmlns:a="http://schemas.openxmlformats.org/drawingml/2006/main" xmlns:pic="http://schemas.openxmlformats.org/drawingml/2006/picture">
             <wp:extent cx="6263640" cy="6800523"/>
-            <wp:docPr id="1" name="Picture 1" descr="Figure 1 Retrieval and review status. 59,147 unique report records identified; human screening and appraisal pending. Selected 38-record register shown separately."/>
+            <wp:docPr id="1" name="Picture 1" descr="Conceptual classification; no quantitative comparison. Preserve the measured variable, comparison axis and outcome. Do not infer patient disparities from clinician payments."/>
             <wp:cNvGraphicFramePr>
               <a:graphicFrameLocks noChangeAspect="1"/>
             </wp:cNvGraphicFramePr>
@@ -502,7 +502,7 @@
               <a:graphicData uri="http://schemas.openxmlformats.org/drawingml/2006/picture">
                 <pic:pic>
                   <pic:nvPicPr>
-                    <pic:cNvPr id="0" name="figure1_retrieval_status.png"/>
+                    <pic:cNvPr id="0" name="figure1_evidence_streams.png"/>
                     <pic:cNvPicPr/>
                   </pic:nvPicPr>
                   <pic:blipFill>
@@ -530,7 +530,289 @@
         <w:pStyle w:val="Caption"/>
       </w:pPr>
       <w:r>
+        <w:t>Three analytic streams answer different questions and require different units of analysis. Patient studies may compare recorded sex or describe care within one eligible population; neither recorded sex nor a diagnosis establishes gender identity. Service and anatomy studies compare procedures, resources or policies. Physician-gender studies compare clinicians and remain contextual to the patient-sex inquiry. Collections, salary and payment per service are distinct measures. Clinical reviews provide an organizing framework. Clinician interviews about patient barriers and prescriber datasets are classified by their analytic question, not by respondents' profession or data source. The diagram defines interpretation boundaries, not causal effects. [L-R01; L-P01; L-C03; L-Q01; L-B01; L-B01-E1]</w:t>
+      </w:r>
+    </w:p>
+    <w:p>
+      <w:pPr>
+        <w:pageBreakBefore/>
+      </w:pPr>
+      <w:r>
+        <w:drawing>
+          <wp:inline xmlns:a="http://schemas.openxmlformats.org/drawingml/2006/main" xmlns:pic="http://schemas.openxmlformats.org/drawingml/2006/picture">
+            <wp:extent cx="6263640" cy="6800523"/>
+            <wp:docPr id="2" name="Picture 2" descr="Adopted population scope, proposed screening routes, exclusions, unresolved eligibility and context are distinguished. No selection counts."/>
+            <wp:cNvGraphicFramePr>
+              <a:graphicFrameLocks noChangeAspect="1"/>
+            </wp:cNvGraphicFramePr>
+            <a:graphic>
+              <a:graphicData uri="http://schemas.openxmlformats.org/drawingml/2006/picture">
+                <pic:pic>
+                  <pic:nvPicPr>
+                    <pic:cNvPr id="0" name="figure2_eligibility_criteria.png"/>
+                    <pic:cNvPicPr/>
+                  </pic:nvPicPr>
+                  <pic:blipFill>
+                    <a:blip r:embed="rId11"/>
+                    <a:stretch>
+                      <a:fillRect/>
+                    </a:stretch>
+                  </pic:blipFill>
+                  <pic:spPr>
+                    <a:xfrm>
+                      <a:off x="0" y="0"/>
+                      <a:ext cx="6263640" cy="6800523"/>
+                    </a:xfrm>
+                    <a:prstGeom prst="rect"/>
+                  </pic:spPr>
+                </pic:pic>
+              </a:graphicData>
+            </a:graphic>
+          </wp:inline>
+        </w:drawing>
+      </w:r>
+    </w:p>
+    <w:p>
+      <w:pPr>
+        <w:pStyle w:val="Caption"/>
+      </w:pPr>
+      <w:r>
+        <w:t>The adopted September 16 scope is distinguished from operational screening proposed September 21. Original Medicare, Medicare Advantage and Part D results are extracted separately. Mixed populations contribute only separable eligible results; unreported gender identity remains unresolved rather than inferred. Code-only research has no individual patient-identity assessment, whereas any patient component requires one. Clinical need is assessed independently of coverage. Contextual records and exclusion reasons remain in the audit trail. The compact framework summarizes REVIEW_SCOPE.md and draft protocol sections 2, 3 and 6; it is not a completed PRISMA selection flow. [M-001]</w:t>
+      </w:r>
+    </w:p>
+    <w:p>
+      <w:pPr>
+        <w:pageBreakBefore/>
+      </w:pPr>
+      <w:r>
+        <w:drawing>
+          <wp:inline xmlns:a="http://schemas.openxmlformats.org/drawingml/2006/main" xmlns:pic="http://schemas.openxmlformats.org/drawingml/2006/picture">
+            <wp:extent cx="6263640" cy="6800523"/>
+            <wp:docPr id="3" name="Picture 3" descr="Conceptual clinical classification; no patient assignment or frequency encoding. These categories describe care, not gender identity. Define clinical need independently of reimbursement rules."/>
+            <wp:cNvGraphicFramePr>
+              <a:graphicFrameLocks noChangeAspect="1"/>
+            </wp:cNvGraphicFramePr>
+            <a:graphic>
+              <a:graphicData uri="http://schemas.openxmlformats.org/drawingml/2006/picture">
+                <pic:pic>
+                  <pic:nvPicPr>
+                    <pic:cNvPr id="0" name="figure3_clinical_basis.png"/>
+                    <pic:cNvPicPr/>
+                  </pic:nvPicPr>
+                  <pic:blipFill>
+                    <a:blip r:embed="rId12"/>
+                    <a:stretch>
+                      <a:fillRect/>
+                    </a:stretch>
+                  </pic:blipFill>
+                  <pic:spPr>
+                    <a:xfrm>
+                      <a:off x="0" y="0"/>
+                      <a:ext cx="6263640" cy="6800523"/>
+                    </a:xfrm>
+                    <a:prstGeom prst="rect"/>
+                  </pic:spPr>
+                </pic:pic>
+              </a:graphicData>
+            </a:graphic>
+          </wp:inline>
+        </w:drawing>
+      </w:r>
+    </w:p>
+    <w:p>
+      <w:pPr>
+        <w:pStyle w:val="Caption"/>
+      </w:pPr>
+      <w:r>
+        <w:t>Care-item classification concerns the recorded indication and anatomical or physiological target. Shared-system care may have unequal disease burden or sex-defined policy eligibility without becoming exclusive to one sex. Reproductive anatomy and reproductive physiology remain distinct: local vaginal treatment and systemic menopausal treatment illustrate this distinction. Mixed or site-dependent services require component-level review before comparison. Policy eligibility and population burden are separate descriptors, not additional anatomical categories. Clinical need is defined independently of reimbursement eligibility, and an opposite-sex counterpart is not required for every indication. These categories neither assign patient identity nor quantify national inequity. [L-B01; L-B01-E1; C-001; C-002; C-003; C-004]</w:t>
+      </w:r>
+    </w:p>
+    <w:p>
+      <w:pPr>
+        <w:pageBreakBefore/>
+      </w:pPr>
+      <w:r>
+        <w:drawing>
+          <wp:inline xmlns:a="http://schemas.openxmlformats.org/drawingml/2006/main" xmlns:pic="http://schemas.openxmlformats.org/drawingml/2006/picture">
+            <wp:extent cx="6263640" cy="6800523"/>
+            <wp:docPr id="4" name="Picture 4" descr="59,147 unique report records identified; human screening and appraisal pending. The selected 38-record register is separate."/>
+            <wp:cNvGraphicFramePr>
+              <a:graphicFrameLocks noChangeAspect="1"/>
+            </wp:cNvGraphicFramePr>
+            <a:graphic>
+              <a:graphicData uri="http://schemas.openxmlformats.org/drawingml/2006/picture">
+                <pic:pic>
+                  <pic:nvPicPr>
+                    <pic:cNvPr id="0" name="figure4_retrieval_status.png"/>
+                    <pic:cNvPicPr/>
+                  </pic:nvPicPr>
+                  <pic:blipFill>
+                    <a:blip r:embed="rId13"/>
+                    <a:stretch>
+                      <a:fillRect/>
+                    </a:stretch>
+                  </pic:blipFill>
+                  <pic:spPr>
+                    <a:xfrm>
+                      <a:off x="0" y="0"/>
+                      <a:ext cx="6263640" cy="6800523"/>
+                    </a:xfrm>
+                    <a:prstGeom prst="rect"/>
+                  </pic:spPr>
+                </pic:pic>
+              </a:graphicData>
+            </a:graphic>
+          </wp:inline>
+        </w:drawing>
+      </w:r>
+    </w:p>
+    <w:p>
+      <w:pPr>
+        <w:pStyle w:val="Caption"/>
+      </w:pPr>
+      <w:r>
         <w:t>Counts describe executed PubMed development searches as of September 21, 2026. Each unique PMID is a report record, not necessarily an independent study. Search extensions were developed after the initial search. No counts of full-text exclusions or final included studies are inferred. The selected 38-record register and targeted intervention retrieval are separate routes requiring later reconciliation. This is an audit diagram, not a completed PRISMA selection flow.</w:t>
+      </w:r>
+    </w:p>
+    <w:p>
+      <w:pPr>
+        <w:pageBreakBefore/>
+      </w:pPr>
+      <w:r>
+        <w:drawing>
+          <wp:inline xmlns:a="http://schemas.openxmlformats.org/drawingml/2006/main" xmlns:pic="http://schemas.openxmlformats.org/drawingml/2006/picture">
+            <wp:extent cx="6263640" cy="6800523"/>
+            <wp:docPr id="5" name="Picture 5" descr="Conceptual measurement pathway; dashed connections are hypotheses, not demonstrated causal effects. Retain payer, policy year, age and entitlement. Compare equity in need, reach and outcomes separately."/>
+            <wp:cNvGraphicFramePr>
+              <a:graphicFrameLocks noChangeAspect="1"/>
+            </wp:cNvGraphicFramePr>
+            <a:graphic>
+              <a:graphicData uri="http://schemas.openxmlformats.org/drawingml/2006/picture">
+                <pic:pic>
+                  <pic:nvPicPr>
+                    <pic:cNvPr id="0" name="figure5_financing_care.png"/>
+                    <pic:cNvPicPr/>
+                  </pic:nvPicPr>
+                  <pic:blipFill>
+                    <a:blip r:embed="rId14"/>
+                    <a:stretch>
+                      <a:fillRect/>
+                    </a:stretch>
+                  </pic:blipFill>
+                  <pic:spPr>
+                    <a:xfrm>
+                      <a:off x="0" y="0"/>
+                      <a:ext cx="6263640" cy="6800523"/>
+                    </a:xfrm>
+                    <a:prstGeom prst="rect"/>
+                  </pic:spPr>
+                </pic:pic>
+              </a:graphicData>
+            </a:graphic>
+          </wp:inline>
+        </w:drawing>
+      </w:r>
+    </w:p>
+    <w:p>
+      <w:pPr>
+        <w:pStyle w:val="Caption"/>
+      </w:pPr>
+      <w:r>
+        <w:t>Financing, access and patient outcomes are distinct measurement domains. The dashed links identify relationships to evaluate; they do not assert that coverage, higher payment or lower recorded spending causes better care. Policy permission differs from authorization performance, clinician receipts and patient out-of-pocket burden. Appropriate receipt, delays and unmet need require patient-level ascertainment, including people who do not complete a transaction. Health and experience outcomes require separate follow-up. Clinical need, indication, alternatives and preferences inform interpretation across the pathway. Analyses retain payer, policy period, age and entitlement, and evaluate equitable reach alongside average benefit. [L-D01; L-R01; L-P01; L-T01; L-T02]</w:t>
+      </w:r>
+    </w:p>
+    <w:p>
+      <w:pPr>
+        <w:pageBreakBefore/>
+      </w:pPr>
+      <w:r>
+        <w:drawing>
+          <wp:inline xmlns:a="http://schemas.openxmlformats.org/drawingml/2006/main" xmlns:pic="http://schemas.openxmlformats.org/drawingml/2006/picture">
+            <wp:extent cx="6263640" cy="6800523"/>
+            <wp:docPr id="6" name="Picture 6" descr="Unranked research-agenda matrix; targets are proposed outcomes, not observed product effects. For every domain: compare existing services; measure harms, burden and equitable reach; verify implementation and buyer need."/>
+            <wp:cNvGraphicFramePr>
+              <a:graphicFrameLocks noChangeAspect="1"/>
+            </wp:cNvGraphicFramePr>
+            <a:graphic>
+              <a:graphicData uri="http://schemas.openxmlformats.org/drawingml/2006/picture">
+                <pic:pic>
+                  <pic:nvPicPr>
+                    <pic:cNvPr id="0" name="figure6_opportunity_domains.png"/>
+                    <pic:cNvPicPr/>
+                  </pic:nvPicPr>
+                  <pic:blipFill>
+                    <a:blip r:embed="rId15"/>
+                    <a:stretch>
+                      <a:fillRect/>
+                    </a:stretch>
+                  </pic:blipFill>
+                  <pic:spPr>
+                    <a:xfrm>
+                      <a:off x="0" y="0"/>
+                      <a:ext cx="6263640" cy="6800523"/>
+                    </a:xfrm>
+                    <a:prstGeom prst="rect"/>
+                  </pic:spPr>
+                </pic:pic>
+              </a:graphicData>
+            </a:graphic>
+          </wp:inline>
+        </w:drawing>
+      </w:r>
+    </w:p>
+    <w:p>
+      <w:pPr>
+        <w:pStyle w:val="Caption"/>
+      </w:pPr>
+      <w:r>
+        <w:t>Six purposively selected domains translate the local evidence register into prospective evaluation questions. The workflow and outcome in each panel are proposals, not established effects of a digital product. Medication and fracture-care interventions provide precedents for testing specified approaches; effectiveness does not automatically transfer to other domains. Procedure valuation initially requires reliable research measurements, with patient effects assessed separately. All proposals require comparison with existing services, clinically appropriate denominators, harms monitoring and explicit equity assessment. Coverage or an interoperability requirement does not establish software reimbursement, customer demand or profitability. Domain order conveys no priority or ranking. [L-T01; L-T02; L-G05; L-P01; L-P02; L-A02; L-Q01; P-054]</w:t>
+      </w:r>
+    </w:p>
+    <w:p>
+      <w:pPr>
+        <w:pageBreakBefore/>
+      </w:pPr>
+      <w:r>
+        <w:drawing>
+          <wp:inline xmlns:a="http://schemas.openxmlformats.org/drawingml/2006/main" xmlns:pic="http://schemas.openxmlformats.org/drawingml/2006/picture">
+            <wp:extent cx="6263640" cy="6800523"/>
+            <wp:docPr id="7" name="Picture 7" descr="Need, mechanism, intervention, benefit and equity, and implementation require distinct evidence."/>
+            <wp:cNvGraphicFramePr>
+              <a:graphicFrameLocks noChangeAspect="1"/>
+            </wp:cNvGraphicFramePr>
+            <a:graphic>
+              <a:graphicData uri="http://schemas.openxmlformats.org/drawingml/2006/picture">
+                <pic:pic>
+                  <pic:nvPicPr>
+                    <pic:cNvPr id="0" name="figure7_validation_pathway.png"/>
+                    <pic:cNvPicPr/>
+                  </pic:nvPicPr>
+                  <pic:blipFill>
+                    <a:blip r:embed="rId16"/>
+                    <a:stretch>
+                      <a:fillRect/>
+                    </a:stretch>
+                  </pic:blipFill>
+                  <pic:spPr>
+                    <a:xfrm>
+                      <a:off x="0" y="0"/>
+                      <a:ext cx="6263640" cy="6800523"/>
+                    </a:xfrm>
+                    <a:prstGeom prst="rect"/>
+                  </pic:spPr>
+                </pic:pic>
+              </a:graphicData>
+            </a:graphic>
+          </wp:inline>
+        </w:drawing>
+      </w:r>
+    </w:p>
+    <w:p>
+      <w:pPr>
+        <w:pStyle w:val="Caption"/>
+      </w:pPr>
+      <w:r>
+        <w:t>Conceptual framework developed for this project after exploratory evidence review. Each stage requires a specified patient population, clinical indication and appropriate comparator. Progress may reveal that clinical support, policy change or an existing service is more useful than new software. Average benefit, equitable reach and commercial feasibility require separate evidence; no composite score or profitability ranking is implied.</w:t>
       </w:r>
     </w:p>
     <w:p>
@@ -1555,53 +1837,6 @@
     </w:p>
     <w:p>
       <w:pPr>
-        <w:pageBreakBefore/>
-      </w:pPr>
-      <w:r>
-        <w:drawing>
-          <wp:inline xmlns:a="http://schemas.openxmlformats.org/drawingml/2006/main" xmlns:pic="http://schemas.openxmlformats.org/drawingml/2006/picture">
-            <wp:extent cx="6263640" cy="6800523"/>
-            <wp:docPr id="2" name="Picture 2" descr="Figure 2 Health IT validation pathway. Need, mechanism, intervention, benefit and equity, and implementation require distinct evidence."/>
-            <wp:cNvGraphicFramePr>
-              <a:graphicFrameLocks noChangeAspect="1"/>
-            </wp:cNvGraphicFramePr>
-            <a:graphic>
-              <a:graphicData uri="http://schemas.openxmlformats.org/drawingml/2006/picture">
-                <pic:pic>
-                  <pic:nvPicPr>
-                    <pic:cNvPr id="0" name="figure2_validation_pathway.png"/>
-                    <pic:cNvPicPr/>
-                  </pic:nvPicPr>
-                  <pic:blipFill>
-                    <a:blip r:embed="rId11"/>
-                    <a:stretch>
-                      <a:fillRect/>
-                    </a:stretch>
-                  </pic:blipFill>
-                  <pic:spPr>
-                    <a:xfrm>
-                      <a:off x="0" y="0"/>
-                      <a:ext cx="6263640" cy="6800523"/>
-                    </a:xfrm>
-                    <a:prstGeom prst="rect"/>
-                  </pic:spPr>
-                </pic:pic>
-              </a:graphicData>
-            </a:graphic>
-          </wp:inline>
-        </w:drawing>
-      </w:r>
-    </w:p>
-    <w:p>
-      <w:pPr>
-        <w:pStyle w:val="Caption"/>
-      </w:pPr>
-      <w:r>
-        <w:t>Conceptual framework developed for this project after exploratory evidence review. Each stage requires a specified patient population, clinical indication and appropriate comparator. Progress may reveal that clinical support, policy change or an existing service is more useful than new software. Average benefit, equitable reach and commercial feasibility require separate evidence; no composite score or profitability ranking is implied.</w:t>
-      </w:r>
-    </w:p>
-    <w:p>
-      <w:pPr>
         <w:pStyle w:val="Heading1"/>
         <w:pageBreakBefore/>
       </w:pPr>
@@ -2427,7 +2662,7 @@
       <w:r>
         <w:t xml:space="preserve">The adopted </w:t>
       </w:r>
-      <w:hyperlink r:id="rId12">
+      <w:hyperlink r:id="rId17">
         <w:r>
           <w:rPr>
             <w:color w:val="173F5F"/>
@@ -2449,7 +2684,7 @@
       <w:r>
         <w:t xml:space="preserve">The active register contains 38 candidate or contextual records, not 38 systematically selected studies. A publication-role audit covers all 38 in </w:t>
       </w:r>
-      <w:hyperlink r:id="rId13">
+      <w:hyperlink r:id="rId18">
         <w:r>
           <w:rPr>
             <w:color w:val="173F5F"/>
@@ -2639,7 +2874,7 @@
                 <w:sz w:val="19"/>
               </w:rPr>
             </w:r>
-            <w:hyperlink r:id="rId14">
+            <w:hyperlink r:id="rId19">
               <w:r>
                 <w:rPr>
                   <w:color w:val="173F5F"/>
@@ -2657,7 +2892,7 @@
               </w:rPr>
               <w:t xml:space="preserve">, </w:t>
             </w:r>
-            <w:hyperlink r:id="rId15">
+            <w:hyperlink r:id="rId20">
               <w:r>
                 <w:rPr>
                   <w:color w:val="173F5F"/>
@@ -2746,7 +2981,7 @@
                 <w:sz w:val="19"/>
               </w:rPr>
             </w:r>
-            <w:hyperlink r:id="rId16">
+            <w:hyperlink r:id="rId21">
               <w:r>
                 <w:rPr>
                   <w:color w:val="173F5F"/>
@@ -2764,7 +2999,7 @@
               </w:rPr>
               <w:t xml:space="preserve">, </w:t>
             </w:r>
-            <w:hyperlink r:id="rId17">
+            <w:hyperlink r:id="rId22">
               <w:r>
                 <w:rPr>
                   <w:color w:val="173F5F"/>
@@ -2782,7 +3017,7 @@
               </w:rPr>
               <w:t xml:space="preserve">, </w:t>
             </w:r>
-            <w:hyperlink r:id="rId18">
+            <w:hyperlink r:id="rId23">
               <w:r>
                 <w:rPr>
                   <w:color w:val="173F5F"/>
@@ -2871,7 +3106,7 @@
                 <w:sz w:val="19"/>
               </w:rPr>
             </w:r>
-            <w:hyperlink r:id="rId19">
+            <w:hyperlink r:id="rId24">
               <w:r>
                 <w:rPr>
                   <w:color w:val="173F5F"/>
@@ -2889,7 +3124,7 @@
               </w:rPr>
               <w:t xml:space="preserve">, </w:t>
             </w:r>
-            <w:hyperlink r:id="rId20">
+            <w:hyperlink r:id="rId25">
               <w:r>
                 <w:rPr>
                   <w:color w:val="173F5F"/>
@@ -2907,7 +3142,7 @@
               </w:rPr>
               <w:t xml:space="preserve">, </w:t>
             </w:r>
-            <w:hyperlink r:id="rId21">
+            <w:hyperlink r:id="rId26">
               <w:r>
                 <w:rPr>
                   <w:color w:val="173F5F"/>
@@ -2996,7 +3231,7 @@
                 <w:sz w:val="19"/>
               </w:rPr>
             </w:r>
-            <w:hyperlink r:id="rId22">
+            <w:hyperlink r:id="rId27">
               <w:r>
                 <w:rPr>
                   <w:color w:val="173F5F"/>
@@ -3014,7 +3249,7 @@
               </w:rPr>
               <w:t xml:space="preserve">, </w:t>
             </w:r>
-            <w:hyperlink r:id="rId23">
+            <w:hyperlink r:id="rId28">
               <w:r>
                 <w:rPr>
                   <w:color w:val="173F5F"/>
@@ -3103,7 +3338,7 @@
                 <w:sz w:val="19"/>
               </w:rPr>
             </w:r>
-            <w:hyperlink r:id="rId24">
+            <w:hyperlink r:id="rId29">
               <w:r>
                 <w:rPr>
                   <w:color w:val="173F5F"/>
@@ -3121,7 +3356,7 @@
               </w:rPr>
               <w:t xml:space="preserve">, </w:t>
             </w:r>
-            <w:hyperlink r:id="rId25">
+            <w:hyperlink r:id="rId30">
               <w:r>
                 <w:rPr>
                   <w:color w:val="173F5F"/>
@@ -3210,7 +3445,7 @@
                 <w:sz w:val="19"/>
               </w:rPr>
             </w:r>
-            <w:hyperlink r:id="rId26">
+            <w:hyperlink r:id="rId31">
               <w:r>
                 <w:rPr>
                   <w:color w:val="173F5F"/>
@@ -3228,7 +3463,7 @@
               </w:rPr>
               <w:t xml:space="preserve">, </w:t>
             </w:r>
-            <w:hyperlink r:id="rId27">
+            <w:hyperlink r:id="rId32">
               <w:r>
                 <w:rPr>
                   <w:color w:val="173F5F"/>
@@ -3291,7 +3526,7 @@
       <w:r>
         <w:t xml:space="preserve">Specific unresolved source issues are preserved in the </w:t>
       </w:r>
-      <w:hyperlink r:id="rId24">
+      <w:hyperlink r:id="rId29">
         <w:r>
           <w:rPr>
             <w:color w:val="173F5F"/>
@@ -3316,7 +3551,7 @@
       <w:r>
         <w:t xml:space="preserve">Formal risk-of-bias and certainty assessments have not been completed. Reviewers will select instruments by design and the result being interpreted. RoB 2 addresses randomized intervention effects; its parallel-group, cluster and crossover variants must not be treated interchangeably. An observational sex association from an RCT-derived cohort is not automatically a randomized contrast. The revised JBI analytical cross-sectional instrument addresses that design's exposure/outcome associations and does not substitute for cohort, prevalence, qualitative, quasi-experimental, or policy appraisal. Exact applicable versions, manuals, interpretation rules and pilot decisions must be documented before appraisal. The primary sources are Sterne et al. </w:t>
       </w:r>
-      <w:hyperlink r:id="rId28">
+      <w:hyperlink r:id="rId33">
         <w:r>
           <w:rPr>
             <w:color w:val="173F5F"/>
@@ -3328,7 +3563,7 @@
       <w:r>
         <w:t xml:space="preserve">, and Barker et al. </w:t>
       </w:r>
-      <w:hyperlink r:id="rId29">
+      <w:hyperlink r:id="rId34">
         <w:r>
           <w:rPr>
             <w:color w:val="173F5F"/>
@@ -3421,7 +3656,7 @@
       <w:r>
         <w:t xml:space="preserve">, Rethlefsen et al., </w:t>
       </w:r>
-      <w:hyperlink r:id="rId30">
+      <w:hyperlink r:id="rId35">
         <w:r>
           <w:rPr>
             <w:color w:val="173F5F"/>
@@ -3539,7 +3774,7 @@
       <w:r>
         <w:t xml:space="preserve">The full </w:t>
       </w:r>
-      <w:hyperlink r:id="rId31">
+      <w:hyperlink r:id="rId36">
         <w:r>
           <w:rPr>
             <w:color w:val="173F5F"/>
@@ -4820,7 +5055,7 @@
       <w:r>
         <w:t xml:space="preserve">Repository: </w:t>
       </w:r>
-      <w:hyperlink r:id="rId32">
+      <w:hyperlink r:id="rId37">
         <w:r>
           <w:rPr>
             <w:color w:val="173F5F"/>
@@ -4847,13 +5082,229 @@
     <w:p>
       <w:pPr>
         <w:keepLines/>
-        <w:spacing w:after="100" w:line="240" w:lineRule="auto"/>
+        <w:spacing w:after="60" w:line="240" w:lineRule="auto"/>
       </w:pPr>
       <w:r>
         <w:rPr>
           <w:sz w:val="20"/>
         </w:rPr>
         <w:t>[L-B01] Mauvais-Jarvis F, Bairey Merz N, Barnes PJ, Brinton RD, Carrero JJ, DeMeo DL, et al. Sex and gender: modifiers of health, disease, and medicine. Lancet. 2020;396(10250):565-582. PMID 32828189. DOI 10.1016/s0140-6736(20)31561-0.</w:t>
+      </w:r>
+      <w:r>
+        <w:t xml:space="preserve"> </w:t>
+      </w:r>
+      <w:hyperlink r:id="rId38">
+        <w:r>
+          <w:rPr>
+            <w:color w:val="173F5F"/>
+            <w:sz w:val="20"/>
+          </w:rPr>
+          <w:t>Source</w:t>
+        </w:r>
+      </w:hyperlink>
+    </w:p>
+    <w:p>
+      <w:pPr>
+        <w:keepLines/>
+        <w:spacing w:after="60" w:line="240" w:lineRule="auto"/>
+      </w:pPr>
+      <w:r>
+        <w:rPr>
+          <w:sz w:val="20"/>
+        </w:rPr>
+        <w:t>[L-B01-E1] Department of Error. Lancet. 2020;396(10252):668. PMID 32891210. DOI 10.1016/s0140-6736(20)31827-4. Correction linked to L-B01; not an independent study.</w:t>
+      </w:r>
+      <w:r>
+        <w:t xml:space="preserve"> </w:t>
+      </w:r>
+      <w:hyperlink r:id="rId39">
+        <w:r>
+          <w:rPr>
+            <w:color w:val="173F5F"/>
+            <w:sz w:val="20"/>
+          </w:rPr>
+          <w:t>Source</w:t>
+        </w:r>
+      </w:hyperlink>
+    </w:p>
+    <w:p>
+      <w:pPr>
+        <w:keepLines/>
+        <w:spacing w:after="60" w:line="240" w:lineRule="auto"/>
+      </w:pPr>
+      <w:r>
+        <w:rPr>
+          <w:sz w:val="20"/>
+        </w:rPr>
+        <w:t>[P-041] Centers for Medicare &amp; Medicaid Services. U.S. Personal Health Care Spending By Age and Sex: 2020 Highlights. Access/status: 2026-09-16.</w:t>
+      </w:r>
+      <w:r>
+        <w:t xml:space="preserve"> </w:t>
+      </w:r>
+      <w:hyperlink r:id="rId40">
+        <w:r>
+          <w:rPr>
+            <w:color w:val="173F5F"/>
+            <w:sz w:val="20"/>
+          </w:rPr>
+          <w:t>Source</w:t>
+        </w:r>
+      </w:hyperlink>
+    </w:p>
+    <w:p>
+      <w:pPr>
+        <w:keepLines/>
+        <w:spacing w:after="60" w:line="240" w:lineRule="auto"/>
+      </w:pPr>
+      <w:r>
+        <w:rPr>
+          <w:sz w:val="20"/>
+        </w:rPr>
+        <w:t>[P-042] Centers for Medicare &amp; Medicaid Services. NHE Fact Sheet. Access/status: 2026-09-16.</w:t>
+      </w:r>
+      <w:r>
+        <w:t xml:space="preserve"> </w:t>
+      </w:r>
+      <w:hyperlink r:id="rId41">
+        <w:r>
+          <w:rPr>
+            <w:color w:val="173F5F"/>
+            <w:sz w:val="20"/>
+          </w:rPr>
+          <w:t>Source</w:t>
+        </w:r>
+      </w:hyperlink>
+    </w:p>
+    <w:p>
+      <w:pPr>
+        <w:keepLines/>
+        <w:spacing w:after="60" w:line="240" w:lineRule="auto"/>
+      </w:pPr>
+      <w:r>
+        <w:rPr>
+          <w:sz w:val="20"/>
+        </w:rPr>
+        <w:t>[P-043] Centers for Medicare &amp; Medicaid Services. Get started with Medicare. Access/status: 2026-09-16.</w:t>
+      </w:r>
+      <w:r>
+        <w:t xml:space="preserve"> </w:t>
+      </w:r>
+      <w:hyperlink r:id="rId42">
+        <w:r>
+          <w:rPr>
+            <w:color w:val="173F5F"/>
+            <w:sz w:val="20"/>
+          </w:rPr>
+          <w:t>Source</w:t>
+        </w:r>
+      </w:hyperlink>
+    </w:p>
+    <w:p>
+      <w:pPr>
+        <w:keepLines/>
+        <w:spacing w:after="60" w:line="240" w:lineRule="auto"/>
+      </w:pPr>
+      <w:r>
+        <w:rPr>
+          <w:sz w:val="20"/>
+        </w:rPr>
+        <w:t>[M-001] Page MJ, McKenzie JE, Bossuyt PM, Boutron I, Hoffmann TC, Mulrow CD, et al. The PRISMA 2020 statement: an updated guideline for reporting systematic reviews. BMJ. 2021;372:n71. PMID 33782057. DOI 10.1136/bmj.n71.</w:t>
+      </w:r>
+      <w:r>
+        <w:t xml:space="preserve"> </w:t>
+      </w:r>
+      <w:hyperlink r:id="rId43">
+        <w:r>
+          <w:rPr>
+            <w:color w:val="173F5F"/>
+            <w:sz w:val="20"/>
+          </w:rPr>
+          <w:t>Source</w:t>
+        </w:r>
+      </w:hyperlink>
+    </w:p>
+    <w:p>
+      <w:pPr>
+        <w:keepLines/>
+        <w:spacing w:after="60" w:line="240" w:lineRule="auto"/>
+      </w:pPr>
+      <w:r>
+        <w:rPr>
+          <w:sz w:val="20"/>
+        </w:rPr>
+        <w:t>[M-004] Rethlefsen ML, Kirtley S, Waffenschmidt S, Ayala AP, Moher D, Page MJ, et al. PRISMA-S: an extension to the PRISMA Statement for Reporting Literature Searches in Systematic Reviews. Syst Rev. 2021;10(1):39. PMID 33499930. DOI 10.1186/s13643-020-01542-z.</w:t>
+      </w:r>
+      <w:r>
+        <w:t xml:space="preserve"> </w:t>
+      </w:r>
+      <w:hyperlink r:id="rId35">
+        <w:r>
+          <w:rPr>
+            <w:color w:val="173F5F"/>
+            <w:sz w:val="20"/>
+          </w:rPr>
+          <w:t>Source</w:t>
+        </w:r>
+      </w:hyperlink>
+    </w:p>
+    <w:p>
+      <w:pPr>
+        <w:keepLines/>
+        <w:spacing w:after="60" w:line="240" w:lineRule="auto"/>
+      </w:pPr>
+      <w:r>
+        <w:rPr>
+          <w:sz w:val="20"/>
+        </w:rPr>
+        <w:t>[M-005] McGowan J, Sampson M, Salzwedel DM, Cogo E, Foerster V, Lefebvre C. PRESS Peer Review of Electronic Search Strategies: 2015 Guideline Statement. J Clin Epidemiol. 2016;75:40-46. PMID 27005575. DOI 10.1016/j.jclinepi.2016.01.021.</w:t>
+      </w:r>
+      <w:r>
+        <w:t xml:space="preserve"> </w:t>
+      </w:r>
+      <w:hyperlink r:id="rId44">
+        <w:r>
+          <w:rPr>
+            <w:color w:val="173F5F"/>
+            <w:sz w:val="20"/>
+          </w:rPr>
+          <w:t>Source</w:t>
+        </w:r>
+      </w:hyperlink>
+    </w:p>
+    <w:p>
+      <w:pPr>
+        <w:keepLines/>
+        <w:spacing w:after="60" w:line="240" w:lineRule="auto"/>
+      </w:pPr>
+      <w:r>
+        <w:rPr>
+          <w:sz w:val="20"/>
+        </w:rPr>
+        <w:t>[M-006] Welch V, Petticrew M, Tugwell P, Moher D, O'Neill J, Waters E, et al. PRISMA-Equity 2012 extension: reporting guidelines for systematic reviews with a focus on health equity. PLoS Med. 2012;9(10):e1001333. PMID 23222917. DOI 10.1371/journal.pmed.1001333.</w:t>
+      </w:r>
+      <w:r>
+        <w:t xml:space="preserve"> </w:t>
+      </w:r>
+      <w:hyperlink r:id="rId45">
+        <w:r>
+          <w:rPr>
+            <w:color w:val="173F5F"/>
+            <w:sz w:val="20"/>
+          </w:rPr>
+          <w:t>Source</w:t>
+        </w:r>
+      </w:hyperlink>
+    </w:p>
+    <w:p>
+      <w:pPr>
+        <w:keepLines/>
+        <w:spacing w:after="60" w:line="240" w:lineRule="auto"/>
+      </w:pPr>
+      <w:r>
+        <w:rPr>
+          <w:sz w:val="20"/>
+        </w:rPr>
+        <w:t>[M-010] Sterne JAC, Savović J, Page MJ, Elbers RG, Blencowe NS, Boutron I, et al. RoB 2: a revised tool for assessing risk of bias in randomised trials. BMJ. 2019;366:l4898. PMID 31462531. DOI 10.1136/bmj.l4898.</w:t>
       </w:r>
       <w:r>
         <w:t xml:space="preserve"> </w:t>
@@ -4871,13 +5322,13 @@
     <w:p>
       <w:pPr>
         <w:keepLines/>
-        <w:spacing w:after="100" w:line="240" w:lineRule="auto"/>
+        <w:spacing w:after="60" w:line="240" w:lineRule="auto"/>
       </w:pPr>
       <w:r>
         <w:rPr>
           <w:sz w:val="20"/>
         </w:rPr>
-        <w:t>[L-B01-E1] Department of Error. Lancet. 2020;396(10252):668. PMID 32891210. DOI 10.1016/s0140-6736(20)31827-4. Correction linked to L-B01; not an independent study.</w:t>
+        <w:t>[M-011] Barker TH, Hasanoff S, Aromataris E, Stone JC, Leonardi-Bee J, Sears K, et al. The revised JBI critical appraisal tool for the assessment of risk of bias for analytical cross-sectional studies. JBI Evid Synth. 2026;24(3):401-408. PMID 40521701. DOI 10.11124/jbies-24-00523.</w:t>
       </w:r>
       <w:r>
         <w:t xml:space="preserve"> </w:t>
@@ -4895,349 +5346,13 @@
     <w:p>
       <w:pPr>
         <w:keepLines/>
-        <w:spacing w:after="100" w:line="240" w:lineRule="auto"/>
-      </w:pPr>
-      <w:r>
-        <w:rPr>
-          <w:sz w:val="20"/>
-        </w:rPr>
-        <w:t>[P-041] Centers for Medicare &amp; Medicaid Services. U.S. Personal Health Care Spending By Age and Sex: 2020 Highlights. Access/status: 2026-09-16.</w:t>
-      </w:r>
-      <w:r>
-        <w:t xml:space="preserve"> </w:t>
-      </w:r>
-      <w:hyperlink r:id="rId35">
-        <w:r>
-          <w:rPr>
-            <w:color w:val="173F5F"/>
-            <w:sz w:val="20"/>
-          </w:rPr>
-          <w:t>Source</w:t>
-        </w:r>
-      </w:hyperlink>
-    </w:p>
-    <w:p>
-      <w:pPr>
-        <w:keepLines/>
-        <w:spacing w:after="100" w:line="240" w:lineRule="auto"/>
-      </w:pPr>
-      <w:r>
-        <w:rPr>
-          <w:sz w:val="20"/>
-        </w:rPr>
-        <w:t>[P-042] Centers for Medicare &amp; Medicaid Services. NHE Fact Sheet. Access/status: 2026-09-16.</w:t>
-      </w:r>
-      <w:r>
-        <w:t xml:space="preserve"> </w:t>
-      </w:r>
-      <w:hyperlink r:id="rId36">
-        <w:r>
-          <w:rPr>
-            <w:color w:val="173F5F"/>
-            <w:sz w:val="20"/>
-          </w:rPr>
-          <w:t>Source</w:t>
-        </w:r>
-      </w:hyperlink>
-    </w:p>
-    <w:p>
-      <w:pPr>
-        <w:keepLines/>
-        <w:spacing w:after="100" w:line="240" w:lineRule="auto"/>
-      </w:pPr>
-      <w:r>
-        <w:rPr>
-          <w:sz w:val="20"/>
-        </w:rPr>
-        <w:t>[P-043] Centers for Medicare &amp; Medicaid Services. Get started with Medicare. Access/status: 2026-09-16.</w:t>
-      </w:r>
-      <w:r>
-        <w:t xml:space="preserve"> </w:t>
-      </w:r>
-      <w:hyperlink r:id="rId37">
-        <w:r>
-          <w:rPr>
-            <w:color w:val="173F5F"/>
-            <w:sz w:val="20"/>
-          </w:rPr>
-          <w:t>Source</w:t>
-        </w:r>
-      </w:hyperlink>
-    </w:p>
-    <w:p>
-      <w:pPr>
-        <w:keepLines/>
-        <w:spacing w:after="100" w:line="240" w:lineRule="auto"/>
-      </w:pPr>
-      <w:r>
-        <w:rPr>
-          <w:sz w:val="20"/>
-        </w:rPr>
-        <w:t>[M-001] Page MJ, McKenzie JE, Bossuyt PM, Boutron I, Hoffmann TC, Mulrow CD, et al. The PRISMA 2020 statement: an updated guideline for reporting systematic reviews. BMJ. 2021;372:n71. PMID 33782057. DOI 10.1136/bmj.n71.</w:t>
-      </w:r>
-      <w:r>
-        <w:t xml:space="preserve"> </w:t>
-      </w:r>
-      <w:hyperlink r:id="rId38">
-        <w:r>
-          <w:rPr>
-            <w:color w:val="173F5F"/>
-            <w:sz w:val="20"/>
-          </w:rPr>
-          <w:t>Source</w:t>
-        </w:r>
-      </w:hyperlink>
-    </w:p>
-    <w:p>
-      <w:pPr>
-        <w:keepLines/>
-        <w:spacing w:after="100" w:line="240" w:lineRule="auto"/>
-      </w:pPr>
-      <w:r>
-        <w:rPr>
-          <w:sz w:val="20"/>
-        </w:rPr>
-        <w:t>[M-004] Rethlefsen ML, Kirtley S, Waffenschmidt S, Ayala AP, Moher D, Page MJ, et al. PRISMA-S: an extension to the PRISMA Statement for Reporting Literature Searches in Systematic Reviews. Syst Rev. 2021;10(1):39. PMID 33499930. DOI 10.1186/s13643-020-01542-z.</w:t>
-      </w:r>
-      <w:r>
-        <w:t xml:space="preserve"> </w:t>
-      </w:r>
-      <w:hyperlink r:id="rId30">
-        <w:r>
-          <w:rPr>
-            <w:color w:val="173F5F"/>
-            <w:sz w:val="20"/>
-          </w:rPr>
-          <w:t>Source</w:t>
-        </w:r>
-      </w:hyperlink>
-    </w:p>
-    <w:p>
-      <w:pPr>
-        <w:keepLines/>
-        <w:spacing w:after="100" w:line="240" w:lineRule="auto"/>
-      </w:pPr>
-      <w:r>
-        <w:rPr>
-          <w:sz w:val="20"/>
-        </w:rPr>
-        <w:t>[M-005] McGowan J, Sampson M, Salzwedel DM, Cogo E, Foerster V, Lefebvre C. PRESS Peer Review of Electronic Search Strategies: 2015 Guideline Statement. J Clin Epidemiol. 2016;75:40-46. PMID 27005575. DOI 10.1016/j.jclinepi.2016.01.021.</w:t>
-      </w:r>
-      <w:r>
-        <w:t xml:space="preserve"> </w:t>
-      </w:r>
-      <w:hyperlink r:id="rId39">
-        <w:r>
-          <w:rPr>
-            <w:color w:val="173F5F"/>
-            <w:sz w:val="20"/>
-          </w:rPr>
-          <w:t>Source</w:t>
-        </w:r>
-      </w:hyperlink>
-    </w:p>
-    <w:p>
-      <w:pPr>
-        <w:keepLines/>
-        <w:spacing w:after="100" w:line="240" w:lineRule="auto"/>
-      </w:pPr>
-      <w:r>
-        <w:rPr>
-          <w:sz w:val="20"/>
-        </w:rPr>
-        <w:t>[M-006] Welch V, Petticrew M, Tugwell P, Moher D, O'Neill J, Waters E, et al. PRISMA-Equity 2012 extension: reporting guidelines for systematic reviews with a focus on health equity. PLoS Med. 2012;9(10):e1001333. PMID 23222917. DOI 10.1371/journal.pmed.1001333.</w:t>
-      </w:r>
-      <w:r>
-        <w:t xml:space="preserve"> </w:t>
-      </w:r>
-      <w:hyperlink r:id="rId40">
-        <w:r>
-          <w:rPr>
-            <w:color w:val="173F5F"/>
-            <w:sz w:val="20"/>
-          </w:rPr>
-          <w:t>Source</w:t>
-        </w:r>
-      </w:hyperlink>
-    </w:p>
-    <w:p>
-      <w:pPr>
-        <w:keepLines/>
-        <w:spacing w:after="100" w:line="240" w:lineRule="auto"/>
-      </w:pPr>
-      <w:r>
-        <w:rPr>
-          <w:sz w:val="20"/>
-        </w:rPr>
-        <w:t>[M-010] Sterne JAC, Savović J, Page MJ, Elbers RG, Blencowe NS, Boutron I, et al. RoB 2: a revised tool for assessing risk of bias in randomised trials. BMJ. 2019;366:l4898. PMID 31462531. DOI 10.1136/bmj.l4898.</w:t>
-      </w:r>
-      <w:r>
-        <w:t xml:space="preserve"> </w:t>
-      </w:r>
-      <w:hyperlink r:id="rId28">
-        <w:r>
-          <w:rPr>
-            <w:color w:val="173F5F"/>
-            <w:sz w:val="20"/>
-          </w:rPr>
-          <w:t>Source</w:t>
-        </w:r>
-      </w:hyperlink>
-    </w:p>
-    <w:p>
-      <w:pPr>
-        <w:keepLines/>
-        <w:spacing w:after="100" w:line="240" w:lineRule="auto"/>
-      </w:pPr>
-      <w:r>
-        <w:rPr>
-          <w:sz w:val="20"/>
-        </w:rPr>
-        <w:t>[M-011] Barker TH, Hasanoff S, Aromataris E, Stone JC, Leonardi-Bee J, Sears K, et al. The revised JBI critical appraisal tool for the assessment of risk of bias for analytical cross-sectional studies. JBI Evid Synth. 2026;24(3):401-408. PMID 40521701. DOI 10.11124/jbies-24-00523.</w:t>
-      </w:r>
-      <w:r>
-        <w:t xml:space="preserve"> </w:t>
-      </w:r>
-      <w:hyperlink r:id="rId29">
-        <w:r>
-          <w:rPr>
-            <w:color w:val="173F5F"/>
-            <w:sz w:val="20"/>
-          </w:rPr>
-          <w:t>Source</w:t>
-        </w:r>
-      </w:hyperlink>
-    </w:p>
-    <w:p>
-      <w:pPr>
-        <w:keepLines/>
-        <w:spacing w:after="100" w:line="240" w:lineRule="auto"/>
+        <w:spacing w:after="60" w:line="240" w:lineRule="auto"/>
       </w:pPr>
       <w:r>
         <w:rPr>
           <w:sz w:val="20"/>
         </w:rPr>
         <w:t>[M-002] Guyatt G, Oxman AD, Akl EA, Kunz R, Vist G, Brozek J, et al. GRADE guidelines: 1. Introduction-GRADE evidence profiles and summary of findings tables. J Clin Epidemiol. 2011;64(4):383-394. PMID 21195583. DOI 10.1016/j.jclinepi.2010.04.026.</w:t>
-      </w:r>
-      <w:r>
-        <w:t xml:space="preserve"> </w:t>
-      </w:r>
-      <w:hyperlink r:id="rId41">
-        <w:r>
-          <w:rPr>
-            <w:color w:val="173F5F"/>
-            <w:sz w:val="20"/>
-          </w:rPr>
-          <w:t>Source</w:t>
-        </w:r>
-      </w:hyperlink>
-    </w:p>
-    <w:p>
-      <w:pPr>
-        <w:keepLines/>
-        <w:spacing w:after="100" w:line="240" w:lineRule="auto"/>
-      </w:pPr>
-      <w:r>
-        <w:rPr>
-          <w:sz w:val="20"/>
-        </w:rPr>
-        <w:t>[M-007] Campbell M, McKenzie JE, Sowden A, Katikireddi SV, Brennan SE, Ellis S, et al. Synthesis without meta-analysis (SWiM) in systematic reviews: reporting guideline. BMJ. 2020;368:l6890. PMID 31948937. DOI 10.1136/bmj.l6890.</w:t>
-      </w:r>
-      <w:r>
-        <w:t xml:space="preserve"> </w:t>
-      </w:r>
-      <w:hyperlink r:id="rId42">
-        <w:r>
-          <w:rPr>
-            <w:color w:val="173F5F"/>
-            <w:sz w:val="20"/>
-          </w:rPr>
-          <w:t>Source</w:t>
-        </w:r>
-      </w:hyperlink>
-    </w:p>
-    <w:p>
-      <w:pPr>
-        <w:keepLines/>
-        <w:spacing w:after="100" w:line="240" w:lineRule="auto"/>
-      </w:pPr>
-      <w:r>
-        <w:rPr>
-          <w:sz w:val="20"/>
-        </w:rPr>
-        <w:t>[M-008] Lewin S, Booth A, Glenton C, Munthe-Kaas H, Rashidian A, Wainwright M, et al. Applying GRADE-CERQual to qualitative evidence synthesis findings: introduction to the series. Implement Sci. 2018;13(Suppl 1):2. PMID 29384079. DOI 10.1186/s13012-017-0688-3.</w:t>
-      </w:r>
-      <w:r>
-        <w:t xml:space="preserve"> </w:t>
-      </w:r>
-      <w:hyperlink r:id="rId43">
-        <w:r>
-          <w:rPr>
-            <w:color w:val="173F5F"/>
-            <w:sz w:val="20"/>
-          </w:rPr>
-          <w:t>Source</w:t>
-        </w:r>
-      </w:hyperlink>
-    </w:p>
-    <w:p>
-      <w:pPr>
-        <w:keepLines/>
-        <w:spacing w:after="100" w:line="240" w:lineRule="auto"/>
-      </w:pPr>
-      <w:r>
-        <w:rPr>
-          <w:sz w:val="20"/>
-        </w:rPr>
-        <w:t>[L-R01] Nekui F, Galbraith AA, Briesacher BA, Zhang F, Soumerai SB, Ross-Degnan D, et al. Cost-related Medication Nonadherence and Its Risk Factors Among Medicare Beneficiaries. Med Care. 2021;59(1):13-21. PMID 33298705. DOI 10.1097/mlr.0000000000001458.</w:t>
-      </w:r>
-      <w:r>
-        <w:t xml:space="preserve"> </w:t>
-      </w:r>
-      <w:hyperlink r:id="rId44">
-        <w:r>
-          <w:rPr>
-            <w:color w:val="173F5F"/>
-            <w:sz w:val="20"/>
-          </w:rPr>
-          <w:t>Source</w:t>
-        </w:r>
-      </w:hyperlink>
-    </w:p>
-    <w:p>
-      <w:pPr>
-        <w:keepLines/>
-        <w:spacing w:after="100" w:line="240" w:lineRule="auto"/>
-      </w:pPr>
-      <w:r>
-        <w:rPr>
-          <w:sz w:val="20"/>
-        </w:rPr>
-        <w:t>[L-R02] De Avila JL, Meltzer DO, Zhang JX. Prevalence and Persistence of Cost-Related Medication Nonadherence Among Medicare Beneficiaries at High Risk of Hospitalization. JAMA Netw Open. 2021;4(3):e210498. PMID 33656528. DOI 10.1001/jamanetworkopen.2021.0498.</w:t>
-      </w:r>
-      <w:r>
-        <w:t xml:space="preserve"> </w:t>
-      </w:r>
-      <w:hyperlink r:id="rId45">
-        <w:r>
-          <w:rPr>
-            <w:color w:val="173F5F"/>
-            <w:sz w:val="20"/>
-          </w:rPr>
-          <w:t>Source</w:t>
-        </w:r>
-      </w:hyperlink>
-    </w:p>
-    <w:p>
-      <w:pPr>
-        <w:keepLines/>
-        <w:spacing w:after="100" w:line="240" w:lineRule="auto"/>
-      </w:pPr>
-      <w:r>
-        <w:rPr>
-          <w:sz w:val="20"/>
-        </w:rPr>
-        <w:t>[L-D01] Tabakin AL, Lee W, Winkler HA, Shalom DF. Vaginal Estrogen Prescribing and Cost Trends Among Medicare Part D Beneficiaries. Urogynecology (Phila). 2025;31(1):58-64. PMID 38527966. DOI 10.1097/spv.0000000000001504.</w:t>
       </w:r>
       <w:r>
         <w:t xml:space="preserve"> </w:t>
@@ -5255,13 +5370,13 @@
     <w:p>
       <w:pPr>
         <w:keepLines/>
-        <w:spacing w:after="100" w:line="240" w:lineRule="auto"/>
+        <w:spacing w:after="60" w:line="240" w:lineRule="auto"/>
       </w:pPr>
       <w:r>
         <w:rPr>
           <w:sz w:val="20"/>
         </w:rPr>
-        <w:t>[L-D03] Mitchell CM, Reed SD, Diem S, Larson JC, Newton KM, Ensrud KE, et al. Efficacy of Vaginal Estradiol or Vaginal Moisturizer vs Placebo for Treating Postmenopausal Vulvovaginal Symptoms: A Randomized Clinical Trial. JAMA Intern Med. 2018;178(5):681-690. PMID 29554173. DOI 10.1001/jamainternmed.2018.0116.</w:t>
+        <w:t>[M-007] Campbell M, McKenzie JE, Sowden A, Katikireddi SV, Brennan SE, Ellis S, et al. Synthesis without meta-analysis (SWiM) in systematic reviews: reporting guideline. BMJ. 2020;368:l6890. PMID 31948937. DOI 10.1136/bmj.l6890.</w:t>
       </w:r>
       <w:r>
         <w:t xml:space="preserve"> </w:t>
@@ -5279,13 +5394,13 @@
     <w:p>
       <w:pPr>
         <w:keepLines/>
-        <w:spacing w:after="100" w:line="240" w:lineRule="auto"/>
+        <w:spacing w:after="60" w:line="240" w:lineRule="auto"/>
       </w:pPr>
       <w:r>
         <w:rPr>
           <w:sz w:val="20"/>
         </w:rPr>
-        <w:t>[L-D04] Danan ER, Sowerby C, Ullman KE, Ensrud K, Forte ML, Zerzan N, et al. Hormonal Treatments and Vaginal Moisturizers for Genitourinary Syndrome of Menopause : A Systematic Review. Ann Intern Med. 2024;177(10):1400-1414. PMID 39250810. DOI 10.7326/annals-24-00610.</w:t>
+        <w:t>[M-008] Lewin S, Booth A, Glenton C, Munthe-Kaas H, Rashidian A, Wainwright M, et al. Applying GRADE-CERQual to qualitative evidence synthesis findings: introduction to the series. Implement Sci. 2018;13(Suppl 1):2. PMID 29384079. DOI 10.1186/s13012-017-0688-3.</w:t>
       </w:r>
       <w:r>
         <w:t xml:space="preserve"> </w:t>
@@ -5303,13 +5418,13 @@
     <w:p>
       <w:pPr>
         <w:keepLines/>
-        <w:spacing w:after="100" w:line="240" w:lineRule="auto"/>
+        <w:spacing w:after="60" w:line="240" w:lineRule="auto"/>
       </w:pPr>
       <w:r>
         <w:rPr>
           <w:sz w:val="20"/>
         </w:rPr>
-        <w:t>[P-002] Paroxetine mesylate 7.5 mg capsule; Ospemifene (Osphena); Vaginal prasterone (Intrarosa); CMS monthly Part D formulary archive. Descriptive source label. Access/status: 2026-09-16.</w:t>
+        <w:t>[L-R01] Nekui F, Galbraith AA, Briesacher BA, Zhang F, Soumerai SB, Ross-Degnan D, et al. Cost-related Medication Nonadherence and Its Risk Factors Among Medicare Beneficiaries. Med Care. 2021;59(1):13-21. PMID 33298705. DOI 10.1097/mlr.0000000000001458.</w:t>
       </w:r>
       <w:r>
         <w:t xml:space="preserve"> </w:t>
@@ -5327,13 +5442,13 @@
     <w:p>
       <w:pPr>
         <w:keepLines/>
-        <w:spacing w:after="100" w:line="240" w:lineRule="auto"/>
+        <w:spacing w:after="60" w:line="240" w:lineRule="auto"/>
       </w:pPr>
       <w:r>
         <w:rPr>
           <w:sz w:val="20"/>
         </w:rPr>
-        <w:t>[P-003] Sildenafil or Viagra for erectile dysfunction; Flibanserin (Addyi) for HSDD; Bremelanotide (Vyleesi) for HSDD. Descriptive source label. Access/status: 2026-09-16.</w:t>
+        <w:t>[L-R02] De Avila JL, Meltzer DO, Zhang JX. Prevalence and Persistence of Cost-Related Medication Nonadherence Among Medicare Beneficiaries at High Risk of Hospitalization. JAMA Netw Open. 2021;4(3):e210498. PMID 33656528. DOI 10.1001/jamanetworkopen.2021.0498.</w:t>
       </w:r>
       <w:r>
         <w:t xml:space="preserve"> </w:t>
@@ -5351,13 +5466,13 @@
     <w:p>
       <w:pPr>
         <w:keepLines/>
-        <w:spacing w:after="100" w:line="240" w:lineRule="auto"/>
+        <w:spacing w:after="60" w:line="240" w:lineRule="auto"/>
       </w:pPr>
       <w:r>
         <w:rPr>
           <w:sz w:val="20"/>
         </w:rPr>
-        <w:t>[P-026] Part D sexual/erectile dysfunction exclusion; sildenafil for pulmonary hypertension and supplemental coverage. Descriptive source label. Access/status: 2026-09-16.</w:t>
+        <w:t>[L-D01] Tabakin AL, Lee W, Winkler HA, Shalom DF. Vaginal Estrogen Prescribing and Cost Trends Among Medicare Part D Beneficiaries. Urogynecology (Phila). 2025;31(1):58-64. PMID 38527966. DOI 10.1097/spv.0000000000001504.</w:t>
       </w:r>
       <w:r>
         <w:t xml:space="preserve"> </w:t>
@@ -5375,13 +5490,13 @@
     <w:p>
       <w:pPr>
         <w:keepLines/>
-        <w:spacing w:after="100" w:line="240" w:lineRule="auto"/>
+        <w:spacing w:after="60" w:line="240" w:lineRule="auto"/>
       </w:pPr>
       <w:r>
         <w:rPr>
           <w:sz w:val="20"/>
         </w:rPr>
-        <w:t>[P-034] CMS formulary reference file. Descriptive source label. Access/status: 2026-09-16.</w:t>
+        <w:t>[L-D03] Mitchell CM, Reed SD, Diem S, Larson JC, Newton KM, Ensrud KE, et al. Efficacy of Vaginal Estradiol or Vaginal Moisturizer vs Placebo for Treating Postmenopausal Vulvovaginal Symptoms: A Randomized Clinical Trial. JAMA Intern Med. 2018;178(5):681-690. PMID 29554173. DOI 10.1001/jamainternmed.2018.0116.</w:t>
       </w:r>
       <w:r>
         <w:t xml:space="preserve"> </w:t>
@@ -5399,13 +5514,13 @@
     <w:p>
       <w:pPr>
         <w:keepLines/>
-        <w:spacing w:after="100" w:line="240" w:lineRule="auto"/>
+        <w:spacing w:after="60" w:line="240" w:lineRule="auto"/>
       </w:pPr>
       <w:r>
         <w:rPr>
           <w:sz w:val="20"/>
         </w:rPr>
-        <w:t>[P-037] Monthly Prescription Drug Plan Formulary and Pharmacy Network Information. Access/status: 2026-09-16.</w:t>
+        <w:t>[L-D04] Danan ER, Sowerby C, Ullman KE, Ensrud K, Forte ML, Zerzan N, et al. Hormonal Treatments and Vaginal Moisturizers for Genitourinary Syndrome of Menopause : A Systematic Review. Ann Intern Med. 2024;177(10):1400-1414. PMID 39250810. DOI 10.7326/annals-24-00610.</w:t>
       </w:r>
       <w:r>
         <w:t xml:space="preserve"> </w:t>
@@ -5423,13 +5538,13 @@
     <w:p>
       <w:pPr>
         <w:keepLines/>
-        <w:spacing w:after="100" w:line="240" w:lineRule="auto"/>
+        <w:spacing w:after="60" w:line="240" w:lineRule="auto"/>
       </w:pPr>
       <w:r>
         <w:rPr>
           <w:sz w:val="20"/>
         </w:rPr>
-        <w:t>[P-038] Data dictionary: Monthly Prescription Drug Plan Formulary and Pharmacy Network Information. Descriptive source label. Access/status: 2026-09-16.</w:t>
+        <w:t>[P-002] Paroxetine mesylate 7.5 mg capsule; Ospemifene (Osphena); Vaginal prasterone (Intrarosa); CMS monthly Part D formulary archive. Descriptive source label. Access/status: 2026-09-16.</w:t>
       </w:r>
       <w:r>
         <w:t xml:space="preserve"> </w:t>
@@ -5447,13 +5562,13 @@
     <w:p>
       <w:pPr>
         <w:keepLines/>
-        <w:spacing w:after="100" w:line="240" w:lineRule="auto"/>
+        <w:spacing w:after="60" w:line="240" w:lineRule="auto"/>
       </w:pPr>
       <w:r>
         <w:rPr>
           <w:sz w:val="20"/>
         </w:rPr>
-        <w:t>[L-P01] Penn M, Colley D, Koirala P, King L, Fitzgerald J. Price and Prejudice: Reimbursement of Surgical Care on Male Versus Female Anatomies. J Womens Health (Larchmt). 2025;34(5):665-676. PMID 39978776. DOI 10.1089/jwh.2024.0984.</w:t>
+        <w:t>[P-003] Sildenafil or Viagra for erectile dysfunction; Flibanserin (Addyi) for HSDD; Bremelanotide (Vyleesi) for HSDD. Descriptive source label. Access/status: 2026-09-16.</w:t>
       </w:r>
       <w:r>
         <w:t xml:space="preserve"> </w:t>
@@ -5471,13 +5586,13 @@
     <w:p>
       <w:pPr>
         <w:keepLines/>
-        <w:spacing w:after="100" w:line="240" w:lineRule="auto"/>
+        <w:spacing w:after="60" w:line="240" w:lineRule="auto"/>
       </w:pPr>
       <w:r>
         <w:rPr>
           <w:sz w:val="20"/>
         </w:rPr>
-        <w:t>[L-P02] Hathaway JK, Schuster MS, Richards KA, Turk TMT. Comparison of Work Relative Value Units Assigned to Urological and Gynecological Surgical Procedures. Urol Pract. 2024;11(4):654-660. PMID 38758183. DOI 10.1097/upj.0000000000000612.</w:t>
+        <w:t>[P-026] Part D sexual/erectile dysfunction exclusion; sildenafil for pulmonary hypertension and supplemental coverage. Descriptive source label. Access/status: 2026-09-16.</w:t>
       </w:r>
       <w:r>
         <w:t xml:space="preserve"> </w:t>
@@ -5495,13 +5610,13 @@
     <w:p>
       <w:pPr>
         <w:keepLines/>
-        <w:spacing w:after="100" w:line="240" w:lineRule="auto"/>
+        <w:spacing w:after="60" w:line="240" w:lineRule="auto"/>
       </w:pPr>
       <w:r>
         <w:rPr>
           <w:sz w:val="20"/>
         </w:rPr>
-        <w:t>[L-P03] Polan RM, Barber EL. Reimbursement for Female-Specific Compared With Male-Specific Procedures Over Time. Obstet Gynecol. 2021;138(6):878-883. PMID 34736273. DOI 10.1097/aog.0000000000004599.</w:t>
+        <w:t>[P-034] CMS formulary reference file. Descriptive source label. Access/status: 2026-09-16.</w:t>
       </w:r>
       <w:r>
         <w:t xml:space="preserve"> </w:t>
@@ -5519,13 +5634,13 @@
     <w:p>
       <w:pPr>
         <w:keepLines/>
-        <w:spacing w:after="100" w:line="240" w:lineRule="auto"/>
+        <w:spacing w:after="60" w:line="240" w:lineRule="auto"/>
       </w:pPr>
       <w:r>
         <w:rPr>
           <w:sz w:val="20"/>
         </w:rPr>
-        <w:t>[L-G04] Curtis JR, Carbone L, Cheng H, Hayes B, Laster A, Matthews R, et al. Longitudinal trends in use of bone mass measurement among older americans, 1999-2005. J Bone Miner Res. 2008;23(7):1061-1067. PMID 18302495. DOI 10.1359/jbmr.080232.</w:t>
+        <w:t>[P-037] Monthly Prescription Drug Plan Formulary and Pharmacy Network Information. Access/status: 2026-09-16.</w:t>
       </w:r>
       <w:r>
         <w:t xml:space="preserve"> </w:t>
@@ -5543,13 +5658,13 @@
     <w:p>
       <w:pPr>
         <w:keepLines/>
-        <w:spacing w:after="100" w:line="240" w:lineRule="auto"/>
+        <w:spacing w:after="60" w:line="240" w:lineRule="auto"/>
       </w:pPr>
       <w:r>
         <w:rPr>
           <w:sz w:val="20"/>
         </w:rPr>
-        <w:t>[L-R03] Gyftopoulos S, Pelzl CE, Da Silva Cardoso M, Xie J, Kwon SC, Chang CY. Bone Density Screening Rates Among Medicare Beneficiaries: An Analysis with a focus on Asian Americans. Skeletal Radiol. 2024;53(11):2347-2355. PMID 38459983. DOI 10.1007/s00256-024-04643-1.</w:t>
+        <w:t>[P-038] Data dictionary: Monthly Prescription Drug Plan Formulary and Pharmacy Network Information. Descriptive source label. Access/status: 2026-09-16.</w:t>
       </w:r>
       <w:r>
         <w:t xml:space="preserve"> </w:t>
@@ -5567,13 +5682,13 @@
     <w:p>
       <w:pPr>
         <w:keepLines/>
-        <w:spacing w:after="100" w:line="240" w:lineRule="auto"/>
+        <w:spacing w:after="60" w:line="240" w:lineRule="auto"/>
       </w:pPr>
       <w:r>
         <w:rPr>
           <w:sz w:val="20"/>
         </w:rPr>
-        <w:t>[L-R04] Gillespie CW, Morin PE. Trends and Disparities in Osteoporosis Screening Among Women in the United States, 2008-2014. Am J Med. 2017;130(3):306-316. PMID 27884649. DOI 10.1016/j.amjmed.2016.10.018.</w:t>
+        <w:t>[L-P01] Penn M, Colley D, Koirala P, King L, Fitzgerald J. Price and Prejudice: Reimbursement of Surgical Care on Male Versus Female Anatomies. J Womens Health (Larchmt). 2025;34(5):665-676. PMID 39978776. DOI 10.1089/jwh.2024.0984.</w:t>
       </w:r>
       <w:r>
         <w:t xml:space="preserve"> </w:t>
@@ -5591,13 +5706,13 @@
     <w:p>
       <w:pPr>
         <w:keepLines/>
-        <w:spacing w:after="100" w:line="240" w:lineRule="auto"/>
+        <w:spacing w:after="60" w:line="240" w:lineRule="auto"/>
       </w:pPr>
       <w:r>
         <w:rPr>
           <w:sz w:val="20"/>
         </w:rPr>
-        <w:t>[L-G05] Pasquale MK, Sheer RL, Yehoshua A, McFadden A, Chines A, Caloyeras J. Evaluation of an Osteoporosis Outreach Program for Men With a Fragility Fracture and Their Physicians. Med Care. 2021;59(2):148-154. PMID 33273290. DOI 10.1097/mlr.0000000000001459.</w:t>
+        <w:t>[L-P02] Hathaway JK, Schuster MS, Richards KA, Turk TMT. Comparison of Work Relative Value Units Assigned to Urological and Gynecological Surgical Procedures. Urol Pract. 2024;11(4):654-660. PMID 38758183. DOI 10.1097/upj.0000000000000612.</w:t>
       </w:r>
       <w:r>
         <w:t xml:space="preserve"> </w:t>
@@ -5615,13 +5730,13 @@
     <w:p>
       <w:pPr>
         <w:keepLines/>
-        <w:spacing w:after="100" w:line="240" w:lineRule="auto"/>
+        <w:spacing w:after="60" w:line="240" w:lineRule="auto"/>
       </w:pPr>
       <w:r>
         <w:rPr>
           <w:sz w:val="20"/>
         </w:rPr>
-        <w:t>[L-C01] Ahmad S, Ramulu P, Akpek E, Deobhakta A, Klawe J. Gender-Specific Trends in Ophthalmologist Medicare Collections. Am J Ophthalmol. 2020;214:32-39. PMID 31926887. DOI 10.1016/j.ajo.2019.12.024.</w:t>
+        <w:t>[L-P03] Polan RM, Barber EL. Reimbursement for Female-Specific Compared With Male-Specific Procedures Over Time. Obstet Gynecol. 2021;138(6):878-883. PMID 34736273. DOI 10.1097/aog.0000000000004599.</w:t>
       </w:r>
       <w:r>
         <w:t xml:space="preserve"> </w:t>
@@ -5639,13 +5754,13 @@
     <w:p>
       <w:pPr>
         <w:keepLines/>
-        <w:spacing w:after="100" w:line="240" w:lineRule="auto"/>
+        <w:spacing w:after="60" w:line="240" w:lineRule="auto"/>
       </w:pPr>
       <w:r>
         <w:rPr>
           <w:sz w:val="20"/>
         </w:rPr>
-        <w:t>[L-C02] Raber I, Al Rifai M, McCarthy CP, Vaduganathan M, Michos ED, Wood MJ, et al. Gender Differences in Medicare Payments Among Cardiologists. JAMA Cardiol. 2021;6(12):1432-1439. PMID 34495296. DOI 10.1001/jamacardio.2021.3385.</w:t>
+        <w:t>[L-G04] Curtis JR, Carbone L, Cheng H, Hayes B, Laster A, Matthews R, et al. Longitudinal trends in use of bone mass measurement among older americans, 1999-2005. J Bone Miner Res. 2008;23(7):1061-1067. PMID 18302495. DOI 10.1359/jbmr.080232.</w:t>
       </w:r>
       <w:r>
         <w:t xml:space="preserve"> </w:t>
@@ -5663,13 +5778,13 @@
     <w:p>
       <w:pPr>
         <w:keepLines/>
-        <w:spacing w:after="100" w:line="240" w:lineRule="auto"/>
+        <w:spacing w:after="60" w:line="240" w:lineRule="auto"/>
       </w:pPr>
       <w:r>
         <w:rPr>
           <w:sz w:val="20"/>
         </w:rPr>
-        <w:t>[L-C03] Munir MM, Dillhoff M, Tsai S, Collins C, Dedhia P, Pawlik TM. Gender-Based Variations in Medicare Reimbursements Among Different Surgical Subspecialties. JAMA Surg. 2024;159(9):1060-1070. PMID 39046733. DOI 10.1001/jamasurg.2024.2298.</w:t>
+        <w:t>[L-R03] Gyftopoulos S, Pelzl CE, Da Silva Cardoso M, Xie J, Kwon SC, Chang CY. Bone Density Screening Rates Among Medicare Beneficiaries: An Analysis with a focus on Asian Americans. Skeletal Radiol. 2024;53(11):2347-2355. PMID 38459983. DOI 10.1007/s00256-024-04643-1.</w:t>
       </w:r>
       <w:r>
         <w:t xml:space="preserve"> </w:t>
@@ -5687,13 +5802,13 @@
     <w:p>
       <w:pPr>
         <w:keepLines/>
-        <w:spacing w:after="100" w:line="240" w:lineRule="auto"/>
+        <w:spacing w:after="60" w:line="240" w:lineRule="auto"/>
       </w:pPr>
       <w:r>
         <w:rPr>
           <w:sz w:val="20"/>
         </w:rPr>
-        <w:t>[L-A01] Dean LT, Ransome Y, Frasso-Jaramillo L, Moss SL, Zhang Y, Ashing K, et al. Drivers of cost differences between US breast cancer survivors with or without lymphedema. J Cancer Surviv. 2019;13(5):804-814. PMID 31446591. DOI 10.1007/s11764-019-00799-1.</w:t>
+        <w:t>[L-R04] Gillespie CW, Morin PE. Trends and Disparities in Osteoporosis Screening Among Women in the United States, 2008-2014. Am J Med. 2017;130(3):306-316. PMID 27884649. DOI 10.1016/j.amjmed.2016.10.018.</w:t>
       </w:r>
       <w:r>
         <w:t xml:space="preserve"> </w:t>
@@ -5711,13 +5826,13 @@
     <w:p>
       <w:pPr>
         <w:keepLines/>
-        <w:spacing w:after="100" w:line="240" w:lineRule="auto"/>
+        <w:spacing w:after="60" w:line="240" w:lineRule="auto"/>
       </w:pPr>
       <w:r>
         <w:rPr>
           <w:sz w:val="20"/>
         </w:rPr>
-        <w:t>[L-A02] Lynn JV, Hespe GE, Akhter MF, David CM, Kung TA, Myers PL. Cross-Sectional Analysis of Insurance Coverage for Lymphedema Treatments in the United States. JAMA Surg. 2023;158(9):920-926. PMID 37285151. DOI 10.1001/jamasurg.2023.2017.</w:t>
+        <w:t>[L-G05] Pasquale MK, Sheer RL, Yehoshua A, McFadden A, Chines A, Caloyeras J. Evaluation of an Osteoporosis Outreach Program for Men With a Fragility Fracture and Their Physicians. Med Care. 2021;59(2):148-154. PMID 33273290. DOI 10.1097/mlr.0000000000001459.</w:t>
       </w:r>
       <w:r>
         <w:t xml:space="preserve"> </w:t>
@@ -5735,13 +5850,13 @@
     <w:p>
       <w:pPr>
         <w:keepLines/>
-        <w:spacing w:after="100" w:line="240" w:lineRule="auto"/>
+        <w:spacing w:after="60" w:line="240" w:lineRule="auto"/>
       </w:pPr>
       <w:r>
         <w:rPr>
           <w:sz w:val="20"/>
         </w:rPr>
-        <w:t>[L-Q01] Tong A, Evangelidis N, Kurnikowski A, Lewandowski M, Bretschneider P, Oberbauer R, et al. Nephrologists' Perspectives on Gender Disparities in CKD and Dialysis. Kidney Int Rep. 2022;7(3):424-435. PMID 35257055. DOI 10.1016/j.ekir.2021.10.022.</w:t>
+        <w:t>[L-C01] Ahmad S, Ramulu P, Akpek E, Deobhakta A, Klawe J. Gender-Specific Trends in Ophthalmologist Medicare Collections. Am J Ophthalmol. 2020;214:32-39. PMID 31926887. DOI 10.1016/j.ajo.2019.12.024.</w:t>
       </w:r>
       <w:r>
         <w:t xml:space="preserve"> </w:t>
@@ -5759,13 +5874,13 @@
     <w:p>
       <w:pPr>
         <w:keepLines/>
-        <w:spacing w:after="100" w:line="240" w:lineRule="auto"/>
+        <w:spacing w:after="60" w:line="240" w:lineRule="auto"/>
       </w:pPr>
       <w:r>
         <w:rPr>
           <w:sz w:val="20"/>
         </w:rPr>
-        <w:t>[L-T01] Agarwal SD, Metzler E, Chernew M, Thomas E, Press VG, Boudreau E, et al. Reduced Cost Sharing and Medication Management Services for COPD: A Randomized Clinical Trial. JAMA Intern Med. 2024;184(10):1186-1194. PMID 39073823. DOI 10.1001/jamainternmed.2024.3499.</w:t>
+        <w:t>[L-C02] Raber I, Al Rifai M, McCarthy CP, Vaduganathan M, Michos ED, Wood MJ, et al. Gender Differences in Medicare Payments Among Cardiologists. JAMA Cardiol. 2021;6(12):1432-1439. PMID 34495296. DOI 10.1001/jamacardio.2021.3385.</w:t>
       </w:r>
       <w:r>
         <w:t xml:space="preserve"> </w:t>
@@ -5783,13 +5898,13 @@
     <w:p>
       <w:pPr>
         <w:keepLines/>
-        <w:spacing w:after="100" w:line="240" w:lineRule="auto"/>
+        <w:spacing w:after="60" w:line="240" w:lineRule="auto"/>
       </w:pPr>
       <w:r>
         <w:rPr>
           <w:sz w:val="20"/>
         </w:rPr>
-        <w:t>[L-T02] Zink A, Wehrly D, Bozzi D, Sutherland A, Boudreau E, McWilliams JM, et al. Prescription Use and Spending After the Introduction of a Real-Time Prescription Benefit Tool. JAMA Netw Open. 2025;8(7):e2519038. PMID 40608336. DOI 10.1001/jamanetworkopen.2025.19038.</w:t>
+        <w:t>[L-C03] Munir MM, Dillhoff M, Tsai S, Collins C, Dedhia P, Pawlik TM. Gender-Based Variations in Medicare Reimbursements Among Different Surgical Subspecialties. JAMA Surg. 2024;159(9):1060-1070. PMID 39046733. DOI 10.1001/jamasurg.2024.2298.</w:t>
       </w:r>
       <w:r>
         <w:t xml:space="preserve"> </w:t>
@@ -5807,13 +5922,13 @@
     <w:p>
       <w:pPr>
         <w:keepLines/>
-        <w:spacing w:after="100" w:line="240" w:lineRule="auto"/>
+        <w:spacing w:after="60" w:line="240" w:lineRule="auto"/>
       </w:pPr>
       <w:r>
         <w:rPr>
           <w:sz w:val="20"/>
         </w:rPr>
-        <w:t>[L-T03] Ying R, Padmanabhan P, Szerencsy A, Mehrotra A, Horwitz LI, Desai SM. Real-Time Prescription Benefit Tool Availability and Prescription Medication Fill Rates: A Post Hoc Analysis of a Cluster Randomized Clinical Trial. JAMA Health Forum. 2026;7(8):e262739. PMID 42599729. DOI 10.1001/jamahealthforum.2026.2739.</w:t>
+        <w:t>[L-A01] Dean LT, Ransome Y, Frasso-Jaramillo L, Moss SL, Zhang Y, Ashing K, et al. Drivers of cost differences between US breast cancer survivors with or without lymphedema. J Cancer Surviv. 2019;13(5):804-814. PMID 31446591. DOI 10.1007/s11764-019-00799-1.</w:t>
       </w:r>
       <w:r>
         <w:t xml:space="preserve"> </w:t>
@@ -5831,13 +5946,13 @@
     <w:p>
       <w:pPr>
         <w:keepLines/>
-        <w:spacing w:after="100" w:line="240" w:lineRule="auto"/>
+        <w:spacing w:after="60" w:line="240" w:lineRule="auto"/>
       </w:pPr>
       <w:r>
         <w:rPr>
           <w:sz w:val="20"/>
         </w:rPr>
-        <w:t>[L-T03-P1] Desai SM, Chen AZ, Wang J, Chung WY, Stadelman J, Mahoney C, et al. Effects of Real-time Prescription Benefit Recommendations on Patient Out-of-Pocket Costs: A Cluster Randomized Clinical Trial. JAMA Intern Med. 2022;182(11):1129-1137. PMID 36094537. DOI 10.1001/jamainternmed.2022.3946. Same trial as L-T03; not an independent trial.</w:t>
+        <w:t>[L-A02] Lynn JV, Hespe GE, Akhter MF, David CM, Kung TA, Myers PL. Cross-Sectional Analysis of Insurance Coverage for Lymphedema Treatments in the United States. JAMA Surg. 2023;158(9):920-926. PMID 37285151. DOI 10.1001/jamasurg.2023.2017.</w:t>
       </w:r>
       <w:r>
         <w:t xml:space="preserve"> </w:t>
@@ -5855,13 +5970,13 @@
     <w:p>
       <w:pPr>
         <w:keepLines/>
-        <w:spacing w:after="100" w:line="240" w:lineRule="auto"/>
+        <w:spacing w:after="60" w:line="240" w:lineRule="auto"/>
       </w:pPr>
       <w:r>
         <w:rPr>
           <w:sz w:val="20"/>
         </w:rPr>
-        <w:t>[P-046] Centers for Medicare &amp; Medicaid Services. CMS Interoperability and Prior Authorization Final Rule CMS-0057-F. Access/status: 2026-09-21.</w:t>
+        <w:t>[L-Q01] Tong A, Evangelidis N, Kurnikowski A, Lewandowski M, Bretschneider P, Oberbauer R, et al. Nephrologists' Perspectives on Gender Disparities in CKD and Dialysis. Kidney Int Rep. 2022;7(3):424-435. PMID 35257055. DOI 10.1016/j.ekir.2021.10.022.</w:t>
       </w:r>
       <w:r>
         <w:t xml:space="preserve"> </w:t>
@@ -5879,13 +5994,13 @@
     <w:p>
       <w:pPr>
         <w:keepLines/>
-        <w:spacing w:after="100" w:line="240" w:lineRule="auto"/>
+        <w:spacing w:after="60" w:line="240" w:lineRule="auto"/>
       </w:pPr>
       <w:r>
         <w:rPr>
           <w:sz w:val="20"/>
         </w:rPr>
-        <w:t>[P-048] Centers for Medicare &amp; Medicaid Services. 2026 CMS Interoperability Standards and Prior Authorization for Drugs Proposed Rule. Access/status: 2026-09-21.</w:t>
+        <w:t>[L-T01] Agarwal SD, Metzler E, Chernew M, Thomas E, Press VG, Boudreau E, et al. Reduced Cost Sharing and Medication Management Services for COPD: A Randomized Clinical Trial. JAMA Intern Med. 2024;184(10):1186-1194. PMID 39073823. DOI 10.1001/jamainternmed.2024.3499.</w:t>
       </w:r>
       <w:r>
         <w:t xml:space="preserve"> </w:t>
@@ -5903,13 +6018,13 @@
     <w:p>
       <w:pPr>
         <w:keepLines/>
-        <w:spacing w:after="100" w:line="240" w:lineRule="auto"/>
+        <w:spacing w:after="60" w:line="240" w:lineRule="auto"/>
       </w:pPr>
       <w:r>
         <w:rPr>
           <w:sz w:val="20"/>
         </w:rPr>
-        <w:t>[P-051] Centers for Medicare &amp; Medicaid Services. Final CY 2026 Part D Redesign Program Instructions. Access/status: 2026-09-21.</w:t>
+        <w:t>[L-T02] Zink A, Wehrly D, Bozzi D, Sutherland A, Boudreau E, McWilliams JM, et al. Prescription Use and Spending After the Introduction of a Real-Time Prescription Benefit Tool. JAMA Netw Open. 2025;8(7):e2519038. PMID 40608336. DOI 10.1001/jamanetworkopen.2025.19038.</w:t>
       </w:r>
       <w:r>
         <w:t xml:space="preserve"> </w:t>
@@ -5927,13 +6042,13 @@
     <w:p>
       <w:pPr>
         <w:keepLines/>
-        <w:spacing w:after="100" w:line="240" w:lineRule="auto"/>
+        <w:spacing w:after="60" w:line="240" w:lineRule="auto"/>
       </w:pPr>
       <w:r>
         <w:rPr>
           <w:sz w:val="20"/>
         </w:rPr>
-        <w:t>[P-052] Medicare.gov / Centers for Medicare &amp; Medicaid Services. Will this payment option help me?. Access/status: 2026-09-21.</w:t>
+        <w:t>[L-T03] Ying R, Padmanabhan P, Szerencsy A, Mehrotra A, Horwitz LI, Desai SM. Real-Time Prescription Benefit Tool Availability and Prescription Medication Fill Rates: A Post Hoc Analysis of a Cluster Randomized Clinical Trial. JAMA Health Forum. 2026;7(8):e262739. PMID 42599729. DOI 10.1001/jamahealthforum.2026.2739.</w:t>
       </w:r>
       <w:r>
         <w:t xml:space="preserve"> </w:t>
@@ -5951,13 +6066,13 @@
     <w:p>
       <w:pPr>
         <w:keepLines/>
-        <w:spacing w:after="100" w:line="240" w:lineRule="auto"/>
+        <w:spacing w:after="60" w:line="240" w:lineRule="auto"/>
       </w:pPr>
       <w:r>
         <w:rPr>
           <w:sz w:val="20"/>
         </w:rPr>
-        <w:t>[P-054] Centers for Medicare &amp; Medicaid Services. Lymphedema Compression Treatment Items. Access/status: 2026-09-21.</w:t>
+        <w:t>[L-T03-P1] Desai SM, Chen AZ, Wang J, Chung WY, Stadelman J, Mahoney C, et al. Effects of Real-time Prescription Benefit Recommendations on Patient Out-of-Pocket Costs: A Cluster Randomized Clinical Trial. JAMA Intern Med. 2022;182(11):1129-1137. PMID 36094537. DOI 10.1001/jamainternmed.2022.3946. Same trial as L-T03; not an independent trial.</w:t>
       </w:r>
       <w:r>
         <w:t xml:space="preserve"> </w:t>
@@ -5975,13 +6090,13 @@
     <w:p>
       <w:pPr>
         <w:keepLines/>
-        <w:spacing w:after="100" w:line="240" w:lineRule="auto"/>
+        <w:spacing w:after="60" w:line="240" w:lineRule="auto"/>
       </w:pPr>
       <w:r>
         <w:rPr>
           <w:sz w:val="20"/>
         </w:rPr>
-        <w:t>[P-047] Centers for Medicare &amp; Medicaid Services. Prior Authorization API. Access/status: 2026-09-21.</w:t>
+        <w:t>[P-046] Centers for Medicare &amp; Medicaid Services. CMS Interoperability and Prior Authorization Final Rule CMS-0057-F. Access/status: 2026-09-21.</w:t>
       </w:r>
       <w:r>
         <w:t xml:space="preserve"> </w:t>
@@ -5999,13 +6114,13 @@
     <w:p>
       <w:pPr>
         <w:keepLines/>
-        <w:spacing w:after="100" w:line="240" w:lineRule="auto"/>
+        <w:spacing w:after="60" w:line="240" w:lineRule="auto"/>
       </w:pPr>
       <w:r>
         <w:rPr>
           <w:sz w:val="20"/>
         </w:rPr>
-        <w:t>[P-055] Medicare.gov / Centers for Medicare &amp; Medicaid Services. Kidney disease education. Access/status: 2026-09-21.</w:t>
+        <w:t>[P-048] Centers for Medicare &amp; Medicaid Services. 2026 CMS Interoperability Standards and Prior Authorization for Drugs Proposed Rule. Access/status: 2026-09-21.</w:t>
       </w:r>
       <w:r>
         <w:t xml:space="preserve"> </w:t>
@@ -6023,13 +6138,13 @@
     <w:p>
       <w:pPr>
         <w:keepLines/>
-        <w:spacing w:after="100" w:line="240" w:lineRule="auto"/>
+        <w:spacing w:after="60" w:line="240" w:lineRule="auto"/>
       </w:pPr>
       <w:r>
         <w:rPr>
           <w:sz w:val="20"/>
         </w:rPr>
-        <w:t>[P-049] Centers for Medicare &amp; Medicaid Services. E-Prescribing Standards and Requirements. Access/status: 2026-09-21.</w:t>
+        <w:t>[P-051] Centers for Medicare &amp; Medicaid Services. Final CY 2026 Part D Redesign Program Instructions. Access/status: 2026-09-21.</w:t>
       </w:r>
       <w:r>
         <w:t xml:space="preserve"> </w:t>
@@ -6047,13 +6162,13 @@
     <w:p>
       <w:pPr>
         <w:keepLines/>
-        <w:spacing w:after="100" w:line="240" w:lineRule="auto"/>
+        <w:spacing w:after="60" w:line="240" w:lineRule="auto"/>
       </w:pPr>
       <w:r>
         <w:rPr>
           <w:sz w:val="20"/>
         </w:rPr>
-        <w:t>[P-050] Office of the National Coordinator for Health Information Technology. HTI-4 Overview and Key Dates for Certification Program. Access/status: 2026-09-21.</w:t>
+        <w:t>[P-052] Medicare.gov / Centers for Medicare &amp; Medicaid Services. Will this payment option help me?. Access/status: 2026-09-21.</w:t>
       </w:r>
       <w:r>
         <w:t xml:space="preserve"> </w:t>
@@ -6071,13 +6186,13 @@
     <w:p>
       <w:pPr>
         <w:keepLines/>
-        <w:spacing w:after="100" w:line="240" w:lineRule="auto"/>
+        <w:spacing w:after="60" w:line="240" w:lineRule="auto"/>
       </w:pPr>
       <w:r>
         <w:rPr>
           <w:sz w:val="20"/>
         </w:rPr>
-        <w:t>[P-056] Food and Drug Administration. Clinical Decision Support Software: Guidance for Industry and Food and Drug Administration Staff. Access/status: 2026-09-21.</w:t>
+        <w:t>[P-054] Centers for Medicare &amp; Medicaid Services. Lymphedema Compression Treatment Items. Access/status: 2026-09-21.</w:t>
       </w:r>
       <w:r>
         <w:t xml:space="preserve"> </w:t>
@@ -6095,13 +6210,13 @@
     <w:p>
       <w:pPr>
         <w:keepLines/>
-        <w:spacing w:after="100" w:line="240" w:lineRule="auto"/>
+        <w:spacing w:after="60" w:line="240" w:lineRule="auto"/>
       </w:pPr>
       <w:r>
         <w:rPr>
           <w:sz w:val="20"/>
         </w:rPr>
-        <w:t>[P-057] Food and Drug Administration. Clinical Decision Support Software Frequently Asked Questions (FAQs). Access/status: 2026-09-21.</w:t>
+        <w:t>[C-001] National Cancer Institute. Male Breast Cancer. Access/status: See source register.</w:t>
       </w:r>
       <w:r>
         <w:t xml:space="preserve"> </w:t>
@@ -6119,13 +6234,13 @@
     <w:p>
       <w:pPr>
         <w:keepLines/>
-        <w:spacing w:after="100" w:line="240" w:lineRule="auto"/>
+        <w:spacing w:after="60" w:line="240" w:lineRule="auto"/>
       </w:pPr>
       <w:r>
         <w:rPr>
           <w:sz w:val="20"/>
         </w:rPr>
-        <w:t>[P-012] Medicare.gov / Centers for Medicare &amp; Medicaid Services. Bone mass measurements. Access/status: 2026-09-21.</w:t>
+        <w:t>[C-002] Eunice Kennedy Shriver National Institute of Child Health and Human Development. About Endometriosis. Access/status: See source register.</w:t>
       </w:r>
       <w:r>
         <w:t xml:space="preserve"> </w:t>
@@ -6143,13 +6258,13 @@
     <w:p>
       <w:pPr>
         <w:keepLines/>
-        <w:spacing w:after="100" w:line="240" w:lineRule="auto"/>
+        <w:spacing w:after="60" w:line="240" w:lineRule="auto"/>
       </w:pPr>
       <w:r>
         <w:rPr>
           <w:sz w:val="20"/>
         </w:rPr>
-        <w:t>[P-053] US Preventive Services Task Force. Osteoporosis to Prevent Fractures: Screening. Access/status: 2026-09-21.</w:t>
+        <w:t>[C-003] National Institute of Diabetes and Digestive and Kidney Diseases. Treatments for Bladder Control Problems (Urinary Incontinence). Access/status: See source register.</w:t>
       </w:r>
       <w:r>
         <w:t xml:space="preserve"> </w:t>
@@ -6167,13 +6282,13 @@
     <w:p>
       <w:pPr>
         <w:keepLines/>
-        <w:spacing w:after="100" w:line="240" w:lineRule="auto"/>
+        <w:spacing w:after="60" w:line="240" w:lineRule="auto"/>
       </w:pPr>
       <w:r>
         <w:rPr>
           <w:sz w:val="20"/>
         </w:rPr>
-        <w:t>[P-059] Centers for Medicare &amp; Medicaid Services. General. Access/status: 2026-09-21.</w:t>
+        <w:t>[C-004] National Institute of Arthritis and Musculoskeletal and Skin Diseases. Osteoporosis in Men. Access/status: See source register.</w:t>
       </w:r>
       <w:r>
         <w:t xml:space="preserve"> </w:t>
@@ -6191,13 +6306,13 @@
     <w:p>
       <w:pPr>
         <w:keepLines/>
-        <w:spacing w:after="100" w:line="240" w:lineRule="auto"/>
+        <w:spacing w:after="60" w:line="240" w:lineRule="auto"/>
       </w:pPr>
       <w:r>
         <w:rPr>
           <w:sz w:val="20"/>
         </w:rPr>
-        <w:t>[L-P04] Uppal S, Rice LW, Spencer RJ. Discrepancies Created by Surgeon Self-Reported Operative Time and the Effects on Procedural Relative Value Units and Reimbursement. Obstet Gynecol. 2021;138(2):182-188. PMID 34237766. DOI 10.1097/aog.0000000000004467.</w:t>
+        <w:t>[P-047] Centers for Medicare &amp; Medicaid Services. Prior Authorization API. Access/status: 2026-09-21.</w:t>
       </w:r>
       <w:r>
         <w:t xml:space="preserve"> </w:t>
@@ -6215,13 +6330,13 @@
     <w:p>
       <w:pPr>
         <w:keepLines/>
-        <w:spacing w:after="100" w:line="240" w:lineRule="auto"/>
+        <w:spacing w:after="60" w:line="240" w:lineRule="auto"/>
       </w:pPr>
       <w:r>
         <w:rPr>
           <w:sz w:val="20"/>
         </w:rPr>
-        <w:t>[P-035] Centers for Medicare &amp; Medicaid Services. RVU26C. Access/status: 2026-09-21.</w:t>
+        <w:t>[P-055] Medicare.gov / Centers for Medicare &amp; Medicaid Services. Kidney disease education. Access/status: 2026-09-21.</w:t>
       </w:r>
       <w:r>
         <w:t xml:space="preserve"> </w:t>
@@ -6239,7 +6354,223 @@
     <w:p>
       <w:pPr>
         <w:keepLines/>
-        <w:spacing w:after="100" w:line="240" w:lineRule="auto"/>
+        <w:spacing w:after="60" w:line="240" w:lineRule="auto"/>
+      </w:pPr>
+      <w:r>
+        <w:rPr>
+          <w:sz w:val="20"/>
+        </w:rPr>
+        <w:t>[P-049] Centers for Medicare &amp; Medicaid Services. E-Prescribing Standards and Requirements. Access/status: 2026-09-21.</w:t>
+      </w:r>
+      <w:r>
+        <w:t xml:space="preserve"> </w:t>
+      </w:r>
+      <w:hyperlink r:id="rId88">
+        <w:r>
+          <w:rPr>
+            <w:color w:val="173F5F"/>
+            <w:sz w:val="20"/>
+          </w:rPr>
+          <w:t>Source</w:t>
+        </w:r>
+      </w:hyperlink>
+    </w:p>
+    <w:p>
+      <w:pPr>
+        <w:keepLines/>
+        <w:spacing w:after="60" w:line="240" w:lineRule="auto"/>
+      </w:pPr>
+      <w:r>
+        <w:rPr>
+          <w:sz w:val="20"/>
+        </w:rPr>
+        <w:t>[P-050] Office of the National Coordinator for Health Information Technology. HTI-4 Overview and Key Dates for Certification Program. Access/status: 2026-09-21.</w:t>
+      </w:r>
+      <w:r>
+        <w:t xml:space="preserve"> </w:t>
+      </w:r>
+      <w:hyperlink r:id="rId89">
+        <w:r>
+          <w:rPr>
+            <w:color w:val="173F5F"/>
+            <w:sz w:val="20"/>
+          </w:rPr>
+          <w:t>Source</w:t>
+        </w:r>
+      </w:hyperlink>
+    </w:p>
+    <w:p>
+      <w:pPr>
+        <w:keepLines/>
+        <w:spacing w:after="60" w:line="240" w:lineRule="auto"/>
+      </w:pPr>
+      <w:r>
+        <w:rPr>
+          <w:sz w:val="20"/>
+        </w:rPr>
+        <w:t>[P-056] Food and Drug Administration. Clinical Decision Support Software: Guidance for Industry and Food and Drug Administration Staff. Access/status: 2026-09-21.</w:t>
+      </w:r>
+      <w:r>
+        <w:t xml:space="preserve"> </w:t>
+      </w:r>
+      <w:hyperlink r:id="rId90">
+        <w:r>
+          <w:rPr>
+            <w:color w:val="173F5F"/>
+            <w:sz w:val="20"/>
+          </w:rPr>
+          <w:t>Source</w:t>
+        </w:r>
+      </w:hyperlink>
+    </w:p>
+    <w:p>
+      <w:pPr>
+        <w:keepLines/>
+        <w:spacing w:after="60" w:line="240" w:lineRule="auto"/>
+      </w:pPr>
+      <w:r>
+        <w:rPr>
+          <w:sz w:val="20"/>
+        </w:rPr>
+        <w:t>[P-057] Food and Drug Administration. Clinical Decision Support Software Frequently Asked Questions (FAQs). Access/status: 2026-09-21.</w:t>
+      </w:r>
+      <w:r>
+        <w:t xml:space="preserve"> </w:t>
+      </w:r>
+      <w:hyperlink r:id="rId91">
+        <w:r>
+          <w:rPr>
+            <w:color w:val="173F5F"/>
+            <w:sz w:val="20"/>
+          </w:rPr>
+          <w:t>Source</w:t>
+        </w:r>
+      </w:hyperlink>
+    </w:p>
+    <w:p>
+      <w:pPr>
+        <w:keepLines/>
+        <w:spacing w:after="60" w:line="240" w:lineRule="auto"/>
+      </w:pPr>
+      <w:r>
+        <w:rPr>
+          <w:sz w:val="20"/>
+        </w:rPr>
+        <w:t>[P-012] Medicare.gov / Centers for Medicare &amp; Medicaid Services. Bone mass measurements. Access/status: 2026-09-21.</w:t>
+      </w:r>
+      <w:r>
+        <w:t xml:space="preserve"> </w:t>
+      </w:r>
+      <w:hyperlink r:id="rId92">
+        <w:r>
+          <w:rPr>
+            <w:color w:val="173F5F"/>
+            <w:sz w:val="20"/>
+          </w:rPr>
+          <w:t>Source</w:t>
+        </w:r>
+      </w:hyperlink>
+    </w:p>
+    <w:p>
+      <w:pPr>
+        <w:keepLines/>
+        <w:spacing w:after="60" w:line="240" w:lineRule="auto"/>
+      </w:pPr>
+      <w:r>
+        <w:rPr>
+          <w:sz w:val="20"/>
+        </w:rPr>
+        <w:t>[P-053] US Preventive Services Task Force. Osteoporosis to Prevent Fractures: Screening. Access/status: 2026-09-21.</w:t>
+      </w:r>
+      <w:r>
+        <w:t xml:space="preserve"> </w:t>
+      </w:r>
+      <w:hyperlink r:id="rId93">
+        <w:r>
+          <w:rPr>
+            <w:color w:val="173F5F"/>
+            <w:sz w:val="20"/>
+          </w:rPr>
+          <w:t>Source</w:t>
+        </w:r>
+      </w:hyperlink>
+    </w:p>
+    <w:p>
+      <w:pPr>
+        <w:keepLines/>
+        <w:spacing w:after="60" w:line="240" w:lineRule="auto"/>
+      </w:pPr>
+      <w:r>
+        <w:rPr>
+          <w:sz w:val="20"/>
+        </w:rPr>
+        <w:t>[P-059] Centers for Medicare &amp; Medicaid Services. General. Access/status: 2026-09-21.</w:t>
+      </w:r>
+      <w:r>
+        <w:t xml:space="preserve"> </w:t>
+      </w:r>
+      <w:hyperlink r:id="rId94">
+        <w:r>
+          <w:rPr>
+            <w:color w:val="173F5F"/>
+            <w:sz w:val="20"/>
+          </w:rPr>
+          <w:t>Source</w:t>
+        </w:r>
+      </w:hyperlink>
+    </w:p>
+    <w:p>
+      <w:pPr>
+        <w:keepLines/>
+        <w:spacing w:after="60" w:line="240" w:lineRule="auto"/>
+      </w:pPr>
+      <w:r>
+        <w:rPr>
+          <w:sz w:val="20"/>
+        </w:rPr>
+        <w:t>[L-P04] Uppal S, Rice LW, Spencer RJ. Discrepancies Created by Surgeon Self-Reported Operative Time and the Effects on Procedural Relative Value Units and Reimbursement. Obstet Gynecol. 2021;138(2):182-188. PMID 34237766. DOI 10.1097/aog.0000000000004467.</w:t>
+      </w:r>
+      <w:r>
+        <w:t xml:space="preserve"> </w:t>
+      </w:r>
+      <w:hyperlink r:id="rId95">
+        <w:r>
+          <w:rPr>
+            <w:color w:val="173F5F"/>
+            <w:sz w:val="20"/>
+          </w:rPr>
+          <w:t>Source</w:t>
+        </w:r>
+      </w:hyperlink>
+    </w:p>
+    <w:p>
+      <w:pPr>
+        <w:keepLines/>
+        <w:spacing w:after="60" w:line="240" w:lineRule="auto"/>
+      </w:pPr>
+      <w:r>
+        <w:rPr>
+          <w:sz w:val="20"/>
+        </w:rPr>
+        <w:t>[P-035] Centers for Medicare &amp; Medicaid Services. RVU26C. Access/status: 2026-09-21.</w:t>
+      </w:r>
+      <w:r>
+        <w:t xml:space="preserve"> </w:t>
+      </w:r>
+      <w:hyperlink r:id="rId96">
+        <w:r>
+          <w:rPr>
+            <w:color w:val="173F5F"/>
+            <w:sz w:val="20"/>
+          </w:rPr>
+          <w:t>Source</w:t>
+        </w:r>
+      </w:hyperlink>
+    </w:p>
+    <w:p>
+      <w:pPr>
+        <w:keepLines/>
+        <w:spacing w:after="60" w:line="240" w:lineRule="auto"/>
       </w:pPr>
       <w:r>
         <w:rPr>
@@ -6250,7 +6581,7 @@
       <w:r>
         <w:t xml:space="preserve"> </w:t>
       </w:r>
-      <w:hyperlink r:id="rId88">
+      <w:hyperlink r:id="rId97">
         <w:r>
           <w:rPr>
             <w:color w:val="173F5F"/>

</xml_diff>